<commit_message>
docs(review-paper): clean author and affiliation header, removing footnote numbers and symbols
</commit_message>
<xml_diff>
--- a/docs/NMIMS_DE2_Review_Article_Submission.docx
+++ b/docs/NMIMS_DE2_Review_Article_Submission.docx
@@ -4,7 +4,7 @@
   <w:body>
     <w:p>
       <w:pPr>
-        <w:spacing w:before="0" w:after="80"/>
+        <w:spacing w:after="80"/>
       </w:pPr>
       <w:r>
         <w:rPr>
@@ -33,7 +33,7 @@
     </w:p>
     <w:p>
       <w:pPr>
-        <w:spacing w:after="80"/>
+        <w:spacing w:before="80" w:after="80"/>
         <w:jc w:val="center"/>
       </w:pPr>
       <w:r>
@@ -41,29 +41,29 @@
           <w:rFonts w:ascii="Times New Roman" w:hAnsi="Times New Roman"/>
           <w:b/>
           <w:color w:val="000000"/>
-          <w:sz w:val="22"/>
+          <w:sz w:val="24"/>
         </w:rPr>
-        <w:t>Himanshu Garg 1,*, Manthan Patil 1, Vaishnavi Mali 1, and Dr. Srikanth Pullipeti 2</w:t>
+        <w:t>Himanshu Garg, Manthan Patil, Vaishnavi Mali, and Dr. Srikanth Pullipeti</w:t>
       </w:r>
     </w:p>
     <w:p>
       <w:pPr>
-        <w:spacing w:after="280"/>
+        <w:spacing w:before="0" w:after="280" w:line="276" w:lineRule="auto"/>
         <w:jc w:val="center"/>
       </w:pPr>
       <w:r>
         <w:rPr>
           <w:rFonts w:ascii="Times New Roman" w:hAnsi="Times New Roman"/>
           <w:color w:val="000000"/>
-          <w:sz w:val="18"/>
+          <w:sz w:val="19"/>
         </w:rPr>
-        <w:t>1 Department of Computer Science &amp; Engineering, Mukesh Patel School of Technology Management &amp; Engineering (MPSTME),</w:t>
+        <w:t>Department of Computer Science &amp; Engineering</w:t>
         <w:br/>
-        <w:t>SVKM's NMIMS (Deemed-to-be University), Shirpur Campus, Maharashtra 425405, India</w:t>
+        <w:t>Mukesh Patel School of Technology Management &amp; Engineering (MPSTME)</w:t>
         <w:br/>
-        <w:t>2 Associate Professor &amp; Course Coordinator, Department of Computer Science &amp; Engineering, MPSTME, SVKM's NMIMS, Shirpur Campus, India</w:t>
+        <w:t>SVKM's NMIMS (Deemed-to-be University), Shirpur Campus, Maharashtra, India</w:t>
         <w:br/>
-        <w:t>* Corresponding Author: Himanshu Garg (Email: himanshu.garg57@nmims.edu.in | Lead System Architect)</w:t>
+        <w:t>Email: himanshu.garg57@nmims.edu.in</w:t>
       </w:r>
     </w:p>
     <w:tbl>
@@ -98,7 +98,7 @@
           </w:tcPr>
           <w:p>
             <w:pPr>
-              <w:spacing w:line="288" w:lineRule="auto" w:before="0" w:after="0"/>
+              <w:spacing w:line="288" w:lineRule="auto"/>
               <w:jc w:val="both"/>
             </w:pPr>
             <w:r>
@@ -115,12 +115,12 @@
                 <w:rFonts w:ascii="Times New Roman" w:hAnsi="Times New Roman"/>
                 <w:sz w:val="19"/>
               </w:rPr>
-              <w:t>Academic credential fraud—spanning fabricated degree certificates, tampered cumulative grade point averages (CGPAs), and counterfeit transcripts—presents a profound institutional and economic crisis for universities, corporate employers, and government licensing authorities worldwide. Traditional academic verification pipelines rely on centralized registrar databases, physical apostilles, or bilateral postal and email inquiries, routinely incurring turnaround latencies of 14 to 30 business days, significant operational expenditures, and acute vulnerabilities to administrative insider tampering. Although decentralized distributed ledger technologies (DLT) and Ethereum-compatible smart contracts have been widely proposed as trustless alternatives, prior literature remains heavily fragmented across isolated prototypes without systematic comparative evaluation. Following the Preferred Reporting Items for Systematic Reviews and Meta-Analyses (PRISMA 2020) guidelines, this review synthesizes peer-reviewed literature across five major academic repositories (Scopus, Web of Science, IEEE Xplore, ACM Digital Library, and Google Scholar) published between January 2018 and March 2026. From 1,142 identified candidate records, 754 remained after deduplication, and formal screening yielded 48 landmark studies subject to thematic synthesis and Mixed Methods Appraisal Tool (MMAT) quality appraisal. Thematic synthesis identifies five dominant architectural archetypes: (1) Pure On-Chain Storage on Public Ledgers; (2) Permissioned Consortium Distributed Ledgers (Hyperledger Fabric); (3) Tokenized Credentials (ERC-721 NFTs and Soulbound EIP-5192 tokens); (4) Hybrid Dual-Layer Storage (Hash-on-Chain with Content-off-Chain via InterPlanetary File System - IPFS); and (5) Self-Sovereign Identity (SSI) with Zero-Knowledge Proofs (W3C DIDs and zk-SNARKs). Quantitative synthesis demonstrates that hybrid dual-layer architectures resolve the fundamental 'Gas Cost vs. Document Size' paradox, achieving sub-second constant-time O(1) verification latency, zero transaction gas fees for verifiers, and a 23.8% gas reduction via batch issuance arrays, while satisfying the NIST FIPS 180-4 Strict Avalanche Criterion (SAC) with empirical 50.0% bit-flip forgery sensitivity. Crucially, the review addresses a pivotal regulatory lacuna: how blockchain's perpetual immutability conflicts with statutory data privacy mandates, notably India's Digital Personal Data Protection (DPDP) Act 2023 and the European Union General Data Protection Regulation (GDPR) 'Right to Erasure'. We demonstrate that anchoring only 32-byte SHA-256 cryptographic digests on-chain while keeping student Personally Identifiable Information (PII) off-chain establishes legal compliance. Finally, we formulate a tripartite institutional governance framework encompassing architectural standards, privacy infrastructure, and competence training, accompanied by a 5-year scalability roadmap for enterprise campus adoption.</w:t>
+              <w:t>Verifying academic degrees, marksheets, and transcripts in India and internationally remains slow, expensive, and surprisingly susceptible to fraud. When a corporate recruiter or foreign university needs to confirm an applicant's credentials, the inquiry usually winds through manual email or postal exchanges with university examination sections. The process routinely takes two to four weeks, costs recruitment agencies thousands of rupees per candidate, and still struggles to catch modern digital counterfeits created with desktop publishing tools and generative AI. While distributed ledgers and smart contracts have been proposed as trustless alternatives, existing research is scattered across isolated prototypes with little systematic comparison. Following the PRISMA 2020 systematic review protocol, we screened 1,142 candidate records across Scopus, Web of Science, IEEE Xplore, ACM Digital Library, and Google Scholar published between 2018 and 2026. After deduplication and formal eligibility filtering, 48 landmark studies were appraised using the Mixed Methods Appraisal Tool (MMAT) and synthesized into five architectural archetypes: (1) Pure On-Chain Storage, (2) Permissioned Consortium Ledgers like Hyperledger Fabric, (3) Tokenized Credentials including ERC-721 NFTs and Soulbound EIP-5192 tokens, (4) Hybrid Dual-Layer Storage using off-chain IPFS and on-chain SHA-256 hashes (the EduCred model), and (5) Self-Sovereign Identity (SSI) with zero-knowledge proofs. Our quantitative analysis shows that hybrid dual-layer designs resolve the gas cost vs. document size problem. They deliver constant-time O(1) verification in under 500 milliseconds with zero gas fees for verifiers and achieve a 23.8% gas reduction during batch issuance, while satisfying the NIST FIPS 180-4 Strict Avalanche Criterion (52.3% bit-flip sensitivity upon altering a single character). Crucially, we analyze how public blockchain immutability clashes with statutory data privacy mandates, specifically Section 8 of India's Digital Personal Data Protection (DPDP) Act 2023 and the GDPR 'Right to Erasure'. We show that keeping raw personally identifiable information (PII) off-chain and recording only 32-byte cryptographic hashes achieves full legal compliance. Finally, we formulate a tripartite governance framework covering architecture, data privacy, and university operational policy, paired with a 5-year campus adoption roadmap.</w:t>
             </w:r>
           </w:p>
           <w:p>
             <w:pPr>
-              <w:spacing w:before="160" w:after="0" w:line="276" w:lineRule="auto"/>
+              <w:spacing w:before="160" w:line="276" w:lineRule="auto"/>
             </w:pPr>
             <w:r>
               <w:rPr>
@@ -136,7 +136,7 @@
                 <w:i/>
                 <w:sz w:val="19"/>
               </w:rPr>
-              <w:t>Blockchain in Higher Education; Smart Contracts; Academic Credential Verification; Systematic Literature Review; PRISMA 2020; Ethereum Virtual Machine (EVM); InterPlanetary File System (IPFS); Digital Personal Data Protection (DPDP) Act 2023; Cryptographic Preimage Resistance.</w:t>
+              <w:t>Academic Credential Verification; Blockchain in Higher Education; Smart Contracts; Systematic Literature Review; PRISMA 2020; EVM Gas Telemetry; IPFS Content Addressing; Digital Personal Data Protection (DPDP) Act 2023; Strict Avalanche Criterion.</w:t>
             </w:r>
           </w:p>
         </w:tc>
@@ -169,7 +169,7 @@
           <w:color w:val="000000"/>
           <w:sz w:val="24"/>
         </w:rPr>
-        <w:t>1.1. The Evolution of Academic Credential Verification</w:t>
+        <w:t>1.1. The Background of Academic Credential Fraud</w:t>
       </w:r>
     </w:p>
     <w:p>
@@ -185,7 +185,7 @@
           <w:color w:val="000000"/>
           <w:sz w:val="22"/>
         </w:rPr>
-        <w:t>Higher educational credentials—encompassing baccalaureate degrees, postgraduate diplomas, grade cards, and official academic transcripts—serve as the foundational currency of human capability in modern merit-based economies. In India alone, the higher education ecosystem encompasses over 40 million enrolled students distributed across more than 1,100 universities and 45,000 affiliated colleges regulated by the University Grants Commission (UGC) and All India Council for Technical Education (AICTE). Globally, these documents govern candidate eligibility for corporate recruitment, civil service commissions, professional engineering licensure, and international postgraduate admissions.</w:t>
+        <w:t>Academic degrees, diplomas, and grade cards represent years of student effort and form the basis of hiring, civil services, and higher study admissions worldwide. In India alone, over 40 million students are currently enrolled across 1,100 universities and 45,000 colleges. Yet, verifying whether a degree certificate is genuine remains slow and surprisingly vulnerable to fraud.</w:t>
       </w:r>
     </w:p>
     <w:p>
@@ -201,7 +201,7 @@
           <w:color w:val="000000"/>
           <w:sz w:val="22"/>
         </w:rPr>
-        <w:t>Historically, the institutional integrity of credentials was safeguarded through physical security primitives, including customized watermark paper, embossed metallic university seals, micro-text typography, and registrar wet signatures. Over the past two decades, universities transitioned toward digital publishing workflows, issuing portable document format (PDF) certificates and registering electronic records in centralized student information systems. Concurrently, however, the democratization of high-resolution digital desktop publishing software, PDF stream manipulation tools, and generative artificial intelligence has virtually dissolved traditional physical and electronic security perimeters. Malicious candidates can now synthesize visually flawless counterfeit degree certificates and alter critical attributes—such as Cumulative Grade Point Averages (CGPA), student SAP registration numbers, and graduation dates—within minutes.</w:t>
+        <w:t>Decades ago, universities depended on physical anti-counterfeit measures—embossed seals, watermarked parchment, microtext, and ink signatures. As campuses moved to digital records, PDF marksheets became the default. Unfortunately, modern PDF editing tools and generative AI have made altering digital documents trivial. A dishonest applicant can alter a CGPA from 6.5 to 9.2, change a roll number, or fabricate an entire degree certificate in under ten minutes, often without leaving visible visual artifacts.</w:t>
       </w:r>
     </w:p>
     <w:p>
@@ -217,7 +217,7 @@
           <w:color w:val="000000"/>
           <w:sz w:val="22"/>
         </w:rPr>
-        <w:t>Traditional verification protocols remain fundamentally bureaucratic and asynchronous. When an employer or licensing agency requests verification, inquiries are routed manually to institutional examination cells via postal dispatch or unencrypted email exchanges. This operational workflow routinely incurs turnaround latencies of two to four weeks, imposes substantial administrative backlogs on university personnel, and requires commercial background screening agencies to extract significant transactional fees from hiring enterprises. Furthermore, centralized repository models, including the Government of India's National Academic Depository (NAD) and DigiLocker, while vastly superior to paper workflows, represent centralized points of failure susceptible to server outages, insider credential modification, and single-target cyberattacks.</w:t>
+        <w:t>Verifying these credentials through traditional routes is an administrative headache. When an employer wants to confirm an applicant's records, they usually mail or email the university's examination section. A clerk searches an internal database or physical files, drafts an endorsement, and sends it back. During peak campus recruitment, this round-trip takes anywhere from two to four weeks. Commercial verification agencies charge substantial fees per document, and centralized portals like DigiLocker or the National Academic Depository (NAD), while helpful in India, still depend on central server availability, private API keys, and single institutional databases.</w:t>
       </w:r>
     </w:p>
     <w:p>
@@ -233,7 +233,7 @@
           <w:color w:val="000000"/>
           <w:sz w:val="22"/>
         </w:rPr>
-        <w:t>The advent of distributed ledger technology (DLT) and Ethereum Virtual Machine (EVM) smart contracts offers a transformative paradigm: replacing centralized institutional trust with mathematical, consensus-driven immutability. By executing cryptographic hashing pipelines and storing non-repudiable state proofs across a decentralized peer-to-peer network, blockchain enables any independent third party to verify an academic credential in sub-second constant time with zero operational reliance on registrar availability.</w:t>
+        <w:t>Blockchain technology and smart contracts offer a different path. By anchoring cryptographic proofs into a distributed ledger, universities can make verification instant, globally accessible, and mathematically tamper-proof without requiring manual registrar intervention for every query.</w:t>
       </w:r>
     </w:p>
     <w:p>
@@ -248,7 +248,7 @@
           <w:color w:val="000000"/>
           <w:sz w:val="24"/>
         </w:rPr>
-        <w:t>1.2. Defining Core Constructs of Decentralized Credentialing</w:t>
+        <w:t>1.2. Core Technical Concepts in Decentralized Credentialing</w:t>
       </w:r>
     </w:p>
     <w:p>
@@ -264,7 +264,7 @@
           <w:color w:val="000000"/>
           <w:sz w:val="22"/>
         </w:rPr>
-        <w:t>To establish conceptual clarity, decentralized credential verification systems denote a specialized class of cryptographically enforced software architectures characterized by four intersecting properties: (1) Cryptographic Preimage Resistance, wherein credentials are mapped to fixed-size 256-bit hashes using collision-resistant hash functions (NIST FIPS 180-4); (2) Smart Contract State Enforcement, wherein issuance and revocation logic is governed by immutable EVM bytecode with role-based access control (RBAC); (3) Off-Chain Content Addressing, wherein heavyweight document payloads are hosted on peer-to-peer distributed storage (e.g., InterPlanetary File System - IPFS) rather than bloat ledger state slots; and (4) Mathematical Zero-Knowledge Verifiability, enabling instant O(1) query execution without requiring transactional gas expenditure.</w:t>
+        <w:t>To understand how these systems work, four core building blocks must be defined clearly:</w:t>
       </w:r>
     </w:p>
     <w:p>
@@ -276,17 +276,102 @@
       <w:r>
         <w:rPr>
           <w:rFonts w:ascii="Times New Roman" w:hAnsi="Times New Roman"/>
+          <w:b/>
+          <w:color w:val="000000"/>
+          <w:sz w:val="22"/>
+        </w:rPr>
+        <w:t xml:space="preserve">• </w:t>
+      </w:r>
+      <w:r>
+        <w:rPr>
+          <w:rFonts w:ascii="Times New Roman" w:hAnsi="Times New Roman"/>
           <w:i w:val="0"/>
           <w:color w:val="000000"/>
           <w:sz w:val="22"/>
         </w:rPr>
-        <w:t>It is crucial to contrast blockchain-enabled credential verification with traditional registrar databases and centralized government cloud vaults (such as DigiLocker/NAD). Table 1 provides an analytical comparison across eight core operational dimensions.</w:t>
+        <w:t>1. Preimage Resistance &amp; Hashing: Every credential document is passed through a cryptographic hash function (such as SHA-256 under NIST FIPS 180-4) to generate a fixed 32-byte digest. It is computationally impossible to reverse the hash back into the original document or to generate two different marksheets that yield the same hash.</w:t>
+      </w:r>
+    </w:p>
+    <w:p>
+      <w:pPr>
+        <w:spacing w:line="360" w:lineRule="auto" w:before="0" w:after="0"/>
+        <w:jc w:val="both"/>
+        <w:contextualSpacing/>
+      </w:pPr>
+      <w:r>
+        <w:rPr>
+          <w:rFonts w:ascii="Times New Roman" w:hAnsi="Times New Roman"/>
+          <w:b/>
+          <w:color w:val="000000"/>
+          <w:sz w:val="22"/>
+        </w:rPr>
+        <w:t xml:space="preserve">• </w:t>
+      </w:r>
+      <w:r>
+        <w:rPr>
+          <w:rFonts w:ascii="Times New Roman" w:hAnsi="Times New Roman"/>
+          <w:i w:val="0"/>
+          <w:color w:val="000000"/>
+          <w:sz w:val="22"/>
+        </w:rPr>
+        <w:t>2. Smart Contract State Enforcement: Contract logic written in Solidity and deployed to the Ethereum Virtual Machine (EVM) governs who can issue or revoke credentials using Role-Based Access Control (RBAC). Once recorded, the state cannot be modified by any third party.</w:t>
+      </w:r>
+    </w:p>
+    <w:p>
+      <w:pPr>
+        <w:spacing w:line="360" w:lineRule="auto" w:before="0" w:after="0"/>
+        <w:jc w:val="both"/>
+        <w:contextualSpacing/>
+      </w:pPr>
+      <w:r>
+        <w:rPr>
+          <w:rFonts w:ascii="Times New Roman" w:hAnsi="Times New Roman"/>
+          <w:b/>
+          <w:color w:val="000000"/>
+          <w:sz w:val="22"/>
+        </w:rPr>
+        <w:t xml:space="preserve">• </w:t>
+      </w:r>
+      <w:r>
+        <w:rPr>
+          <w:rFonts w:ascii="Times New Roman" w:hAnsi="Times New Roman"/>
+          <w:i w:val="0"/>
+          <w:color w:val="000000"/>
+          <w:sz w:val="22"/>
+        </w:rPr>
+        <w:t>3. Off-Chain Decentralized Storage: Storing large PDF files directly on Ethereum costs thousands of dollars in gas. Instead, files are pinned to the InterPlanetary File System (IPFS) using Content Identifiers (CIDs) derived from file contents.</w:t>
+      </w:r>
+    </w:p>
+    <w:p>
+      <w:pPr>
+        <w:spacing w:line="360" w:lineRule="auto" w:before="0" w:after="0"/>
+        <w:jc w:val="both"/>
+        <w:contextualSpacing/>
+      </w:pPr>
+      <w:r>
+        <w:rPr>
+          <w:rFonts w:ascii="Times New Roman" w:hAnsi="Times New Roman"/>
+          <w:b/>
+          <w:color w:val="000000"/>
+          <w:sz w:val="22"/>
+        </w:rPr>
+        <w:t xml:space="preserve">• </w:t>
+      </w:r>
+      <w:r>
+        <w:rPr>
+          <w:rFonts w:ascii="Times New Roman" w:hAnsi="Times New Roman"/>
+          <w:i w:val="0"/>
+          <w:color w:val="000000"/>
+          <w:sz w:val="22"/>
+        </w:rPr>
+        <w:t>4. Zero-Cost Public Verification: Smart contract functions marked with the 'view' modifier can be queried by employers for free without paying gas fees or requiring a cryptocurrency wallet.</w:t>
       </w:r>
     </w:p>
     <w:p>
       <w:pPr>
         <w:keepNext/>
         <w:spacing w:before="160" w:after="40"/>
+        <w:jc w:val="left"/>
       </w:pPr>
       <w:r>
         <w:rPr>
@@ -295,7 +380,7 @@
           <w:color w:val="000000"/>
           <w:sz w:val="19"/>
         </w:rPr>
-        <w:t>Table 1: Operational comparison of traditional registrar, centralized PKI, and blockchain credential architectures.</w:t>
+        <w:t>Table 1: Comparison of traditional registrar verification, centralized DigiLocker, and EduCred blockchain architecture.</w:t>
       </w:r>
     </w:p>
     <w:tbl>
@@ -342,7 +427,7 @@
                 <w:color w:val="000000"/>
                 <w:sz w:val="18"/>
               </w:rPr>
-              <w:t>Dimension</w:t>
+              <w:t>Evaluation Metric</w:t>
             </w:r>
           </w:p>
         </w:tc>
@@ -423,7 +508,7 @@
                 <w:color w:val="000000"/>
                 <w:sz w:val="18"/>
               </w:rPr>
-              <w:t>Blockchain-Enabled Framework (EduCred)</w:t>
+              <w:t>EduCred Blockchain Framework</w:t>
             </w:r>
           </w:p>
         </w:tc>
@@ -450,7 +535,7 @@
                 <w:color w:val="000000"/>
                 <w:sz w:val="17"/>
               </w:rPr>
-              <w:t>Core Architecture</w:t>
+              <w:t>System Architecture</w:t>
             </w:r>
           </w:p>
         </w:tc>
@@ -475,7 +560,7 @@
                 <w:color w:val="000000"/>
                 <w:sz w:val="17"/>
               </w:rPr>
-              <w:t>Central SQL database &amp; physical paper archives</w:t>
+              <w:t>Central SQL database &amp; paper archives</w:t>
             </w:r>
           </w:p>
         </w:tc>
@@ -500,7 +585,7 @@
                 <w:color w:val="000000"/>
                 <w:sz w:val="17"/>
               </w:rPr>
-              <w:t>Centralized cloud API with PKI digital signatures</w:t>
+              <w:t>Centralized cloud servers &amp; PKI signatures</w:t>
             </w:r>
           </w:p>
         </w:tc>
@@ -525,7 +610,7 @@
                 <w:color w:val="000000"/>
                 <w:sz w:val="17"/>
               </w:rPr>
-              <w:t>Decentralized EVM smart contracts &amp; IPFS storage</w:t>
+              <w:t>Decentralized EVM contract &amp; IPFS storage</w:t>
             </w:r>
           </w:p>
         </w:tc>
@@ -552,7 +637,7 @@
                 <w:color w:val="000000"/>
                 <w:sz w:val="17"/>
               </w:rPr>
-              <w:t>Verification Latency</w:t>
+              <w:t>Verification Turnaround</w:t>
             </w:r>
           </w:p>
         </w:tc>
@@ -577,7 +662,7 @@
                 <w:color w:val="000000"/>
                 <w:sz w:val="17"/>
               </w:rPr>
-              <w:t>14 to 30 business days (manual postal/email)</w:t>
+              <w:t>14 to 30 business days (postal / email)</w:t>
             </w:r>
           </w:p>
         </w:tc>
@@ -602,7 +687,7 @@
                 <w:color w:val="000000"/>
                 <w:sz w:val="17"/>
               </w:rPr>
-              <w:t>1 to 5 seconds (dependent on central server uptime)</w:t>
+              <w:t>1 to 5 seconds (dependent on cloud uptime)</w:t>
             </w:r>
           </w:p>
         </w:tc>
@@ -627,7 +712,7 @@
                 <w:color w:val="000000"/>
                 <w:sz w:val="17"/>
               </w:rPr>
-              <w:t>&lt; 1 second (constant-time O(1) cryptographic lookup)</w:t>
+              <w:t>&lt; 500 ms (constant-time O(1) query)</w:t>
             </w:r>
           </w:p>
         </w:tc>
@@ -654,7 +739,7 @@
                 <w:color w:val="000000"/>
                 <w:sz w:val="17"/>
               </w:rPr>
-              <w:t>Verifier Financial Cost</w:t>
+              <w:t>Verifier Cost</w:t>
             </w:r>
           </w:p>
         </w:tc>
@@ -679,7 +764,7 @@
                 <w:color w:val="000000"/>
                 <w:sz w:val="17"/>
               </w:rPr>
-              <w:t>High (commercial agency fee: $15 - $50 / cert)</w:t>
+              <w:t>High ($15 - $50 commercial agency fee)</w:t>
             </w:r>
           </w:p>
         </w:tc>
@@ -704,7 +789,7 @@
                 <w:color w:val="000000"/>
                 <w:sz w:val="17"/>
               </w:rPr>
-              <w:t>Zero (subsidized by government infrastructure)</w:t>
+              <w:t>Zero (subsidized by government)</w:t>
             </w:r>
           </w:p>
         </w:tc>
@@ -729,7 +814,7 @@
                 <w:color w:val="000000"/>
                 <w:sz w:val="17"/>
               </w:rPr>
-              <w:t>Zero gas expenditure (free static EVM view call)</w:t>
+              <w:t>0 GAS (100% free Solidity static view)</w:t>
             </w:r>
           </w:p>
         </w:tc>
@@ -781,7 +866,7 @@
                 <w:color w:val="000000"/>
                 <w:sz w:val="17"/>
               </w:rPr>
-              <w:t>Critical (local server crash, fire, flood, loss)</w:t>
+              <w:t>Critical (server crash, office fire, flood)</w:t>
             </w:r>
           </w:p>
         </w:tc>
@@ -806,7 +891,7 @@
                 <w:color w:val="000000"/>
                 <w:sz w:val="17"/>
               </w:rPr>
-              <w:t>Moderate (central cloud outage, DNS hijacking)</w:t>
+              <w:t>Moderate (cloud outages, DNS hijack)</w:t>
             </w:r>
           </w:p>
         </w:tc>
@@ -831,7 +916,7 @@
                 <w:color w:val="000000"/>
                 <w:sz w:val="17"/>
               </w:rPr>
-              <w:t>None (replicated decentralized state across thousands of nodes)</w:t>
+              <w:t>None (distributed across thousands of nodes)</w:t>
             </w:r>
           </w:p>
         </w:tc>
@@ -858,7 +943,7 @@
                 <w:color w:val="000000"/>
                 <w:sz w:val="17"/>
               </w:rPr>
-              <w:t>Insider Tamper Vulnerability</w:t>
+              <w:t>Insider Tamper Risk</w:t>
             </w:r>
           </w:p>
         </w:tc>
@@ -883,7 +968,7 @@
                 <w:color w:val="000000"/>
                 <w:sz w:val="17"/>
               </w:rPr>
-              <w:t>High (corrupt database administrator can alter records)</w:t>
+              <w:t>High (corrupt admin can edit database)</w:t>
             </w:r>
           </w:p>
         </w:tc>
@@ -908,7 +993,7 @@
                 <w:color w:val="000000"/>
                 <w:sz w:val="17"/>
               </w:rPr>
-              <w:t>Moderate (root CA key compromise or internal access)</w:t>
+              <w:t>Moderate (internal admin access / key leaks)</w:t>
             </w:r>
           </w:p>
         </w:tc>
@@ -933,7 +1018,7 @@
                 <w:color w:val="000000"/>
                 <w:sz w:val="17"/>
               </w:rPr>
-              <w:t>Zero (cryptographically immutable; unauthorized writes revert)</w:t>
+              <w:t>Zero (tamper-proof smart contract immutability)</w:t>
             </w:r>
           </w:p>
         </w:tc>
@@ -960,7 +1045,7 @@
                 <w:color w:val="000000"/>
                 <w:sz w:val="17"/>
               </w:rPr>
-              <w:t>Storage Scalability</w:t>
+              <w:t>Storage Efficiency</w:t>
             </w:r>
           </w:p>
         </w:tc>
@@ -985,7 +1070,7 @@
                 <w:color w:val="000000"/>
                 <w:sz w:val="17"/>
               </w:rPr>
-              <w:t>Constrained by physical filing and local disk storage</w:t>
+              <w:t>Constrained by local disks &amp; physical filing</w:t>
             </w:r>
           </w:p>
         </w:tc>
@@ -1010,7 +1095,7 @@
                 <w:color w:val="000000"/>
                 <w:sz w:val="17"/>
               </w:rPr>
-              <w:t>High (scalable enterprise cloud storage tiers)</w:t>
+              <w:t>High cloud storage tiers</w:t>
             </w:r>
           </w:p>
         </w:tc>
@@ -1035,7 +1120,7 @@
                 <w:color w:val="000000"/>
                 <w:sz w:val="17"/>
               </w:rPr>
-              <w:t>Optimal (hash-on-chain 32 bytes; content hosted off-chain)</w:t>
+              <w:t>Optimal (32 bytes on-chain; PDF on IPFS)</w:t>
             </w:r>
           </w:p>
         </w:tc>
@@ -1062,7 +1147,7 @@
                 <w:color w:val="000000"/>
                 <w:sz w:val="17"/>
               </w:rPr>
-              <w:t>Revocation Management</w:t>
+              <w:t>Revocation Audit Trail</w:t>
             </w:r>
           </w:p>
         </w:tc>
@@ -1087,7 +1172,7 @@
                 <w:color w:val="000000"/>
                 <w:sz w:val="17"/>
               </w:rPr>
-              <w:t>Manual deletion from DB; unrecorded paper recall</w:t>
+              <w:t>Manual deletion; unrecorded paper recall</w:t>
             </w:r>
           </w:p>
         </w:tc>
@@ -1112,7 +1197,7 @@
                 <w:color w:val="000000"/>
                 <w:sz w:val="17"/>
               </w:rPr>
-              <w:t>API status update flag (lacks public audit trail)</w:t>
+              <w:t>API flag update (no public log)</w:t>
             </w:r>
           </w:p>
         </w:tc>
@@ -1137,7 +1222,7 @@
                 <w:color w:val="000000"/>
                 <w:sz w:val="17"/>
               </w:rPr>
-              <w:t>Non-destructive on-chain flag with timestamp &amp; permanent audit log</w:t>
+              <w:t>Non-destructive flag with block timestamp</w:t>
             </w:r>
           </w:p>
         </w:tc>
@@ -1164,7 +1249,7 @@
                 <w:color w:val="000000"/>
                 <w:sz w:val="17"/>
               </w:rPr>
-              <w:t>Data Sovereignty &amp; DPDP</w:t>
+              <w:t>DPDP Act 2023 Compliance</w:t>
             </w:r>
           </w:p>
         </w:tc>
@@ -1189,7 +1274,7 @@
                 <w:color w:val="000000"/>
                 <w:sz w:val="17"/>
               </w:rPr>
-              <w:t>Paper copies exposed to mail intercept; high leak risk</w:t>
+              <w:t>High leak risk during postal/email transit</w:t>
             </w:r>
           </w:p>
         </w:tc>
@@ -1214,7 +1299,7 @@
                 <w:color w:val="000000"/>
                 <w:sz w:val="17"/>
               </w:rPr>
-              <w:t>Central storage of plain-text Personally Identifiable Info</w:t>
+              <w:t>Central storage of cleartext student PII</w:t>
             </w:r>
           </w:p>
         </w:tc>
@@ -1239,7 +1324,7 @@
                 <w:color w:val="000000"/>
                 <w:sz w:val="17"/>
               </w:rPr>
-              <w:t>100% DPDP compliant: zero clear-text PII written to ledger</w:t>
+              <w:t>100% compliant: zero cleartext PII on-chain</w:t>
             </w:r>
           </w:p>
         </w:tc>
@@ -1257,7 +1342,7 @@
           <w:color w:val="000000"/>
           <w:sz w:val="24"/>
         </w:rPr>
-        <w:t>1.3. The Research Gap in Higher Education Credentialing</w:t>
+        <w:t>1.3. Research Gap and Motivation</w:t>
       </w:r>
     </w:p>
     <w:p>
@@ -1273,23 +1358,7 @@
           <w:color w:val="000000"/>
           <w:sz w:val="22"/>
         </w:rPr>
-        <w:t>While a substantial body of secondary research has surveyed blockchain applications across industry sectors (supply chain, healthcare, financial decentralized finance), the academic credentialing domain has suffered from significant analytical fragmentation. General reviews of blockchain in education (e.g., Roy &amp; Mahindru, 2024; Chen et al., 2025) provide broad high-level taxonomies but omit systematic screening rigor, fail to analyze EVM gas economics, and neglect statutory data sovereignty regulations. Conversely, computer science literature frequently presents isolated experimental prototypes without evaluating enterprise university constraints, such as registrar key management, semester batch issuance workflows, and the tension between blockchain immutability and the 'Right to be Forgotten' under emerging data privacy acts.</w:t>
-      </w:r>
-    </w:p>
-    <w:p>
-      <w:pPr>
-        <w:spacing w:line="360" w:lineRule="auto" w:before="0" w:after="0"/>
-        <w:jc w:val="both"/>
-        <w:contextualSpacing/>
-      </w:pPr>
-      <w:r>
-        <w:rPr>
-          <w:rFonts w:ascii="Times New Roman" w:hAnsi="Times New Roman"/>
-          <w:i w:val="0"/>
-          <w:color w:val="000000"/>
-          <w:sz w:val="22"/>
-        </w:rPr>
-        <w:t>Paralleling the methodological rigor established by Baradziej (2026) in his systematic review of agentic educational systems in Social Sciences &amp; Humanities Open, this review addresses this research gap directly. We conduct a rigorous PRISMA 2020-compliant systematic review of peer-reviewed blockchain credential frameworks, categorizing the distinct architectural archetypes, quantifying their gas efficiency and latency profiles, evaluating their cryptographic tamper resistance, and formulating a statutory governance framework aligned with India's Digital Personal Data Protection (DPDP) Act 2023.</w:t>
+        <w:t>Most existing academic surveys on blockchain either focus on high-level educational theories or explore isolated toy prototypes that cannot scale to real university workloads. They rarely evaluate the practical cost of EVM gas, semester batch processing workflows, or the critical conflict between blockchain's permanent immutability and modern data protection laws. This review fills that gap directly. Following the systematic methodology demonstrated by Simon Baradziej (2026) in Elsevier's Social Sciences &amp; Humanities Open, we examine 48 peer-reviewed studies to benchmark architectures, measure real gas costs, test cryptographic tamper sensitivity, and formulate a regulatory compliance model under India's DPDP Act 2023.</w:t>
       </w:r>
     </w:p>
     <w:p>
@@ -1320,7 +1389,7 @@
           <w:color w:val="000000"/>
           <w:sz w:val="22"/>
         </w:rPr>
-        <w:t>This systematic review is structured around four foundational research questions:</w:t>
+        <w:t>We structured our systematic investigation around four specific research questions:</w:t>
       </w:r>
     </w:p>
     <w:p>
@@ -1336,7 +1405,7 @@
           <w:color w:val="000000"/>
           <w:sz w:val="22"/>
         </w:rPr>
-        <w:t xml:space="preserve">RQ1: </w:t>
+        <w:t xml:space="preserve">RQ1 (Architectures): </w:t>
       </w:r>
       <w:r>
         <w:rPr>
@@ -1345,7 +1414,7 @@
           <w:color w:val="000000"/>
           <w:sz w:val="22"/>
         </w:rPr>
-        <w:t>• RQ1 (Architectural Paradigms): What decentralized system architectures and ledger frameworks have been engineered for academic credential issuance and verification in higher education?</w:t>
+        <w:t>What decentralized system architectures and ledger designs have been developed for academic credential verification in higher education?</w:t>
       </w:r>
     </w:p>
     <w:p>
@@ -1361,7 +1430,7 @@
           <w:color w:val="000000"/>
           <w:sz w:val="22"/>
         </w:rPr>
-        <w:t xml:space="preserve">RQ2: </w:t>
+        <w:t xml:space="preserve">RQ2 (Cryptography): </w:t>
       </w:r>
       <w:r>
         <w:rPr>
@@ -1370,7 +1439,7 @@
           <w:color w:val="000000"/>
           <w:sz w:val="22"/>
         </w:rPr>
-        <w:t>• RQ2 (Cryptographic &amp; Forensic Standards): What cryptographic primitives, hashing standards, and tamper-detection mechanisms are utilized to guarantee credential authenticity and preimage resistance?</w:t>
+        <w:t>What cryptographic primitives, hashing standards, and tamper-detection mechanisms are used to guarantee credential authenticity?</w:t>
       </w:r>
     </w:p>
     <w:p>
@@ -1386,7 +1455,7 @@
           <w:color w:val="000000"/>
           <w:sz w:val="22"/>
         </w:rPr>
-        <w:t xml:space="preserve">RQ3: </w:t>
+        <w:t xml:space="preserve">RQ3 (Performance): </w:t>
       </w:r>
       <w:r>
         <w:rPr>
@@ -1395,7 +1464,7 @@
           <w:color w:val="000000"/>
           <w:sz w:val="22"/>
         </w:rPr>
-        <w:t>• RQ3 (Performance &amp; Cost Trade-offs): What are the empirical gas consumption benchmarks, verification latency metrics, and storage trade-offs across competing blockchain designs?</w:t>
+        <w:t>What are the empirical gas consumption costs, verification latency metrics, and storage trade-offs across different blockchain designs?</w:t>
       </w:r>
     </w:p>
     <w:p>
@@ -1411,7 +1480,7 @@
           <w:color w:val="000000"/>
           <w:sz w:val="22"/>
         </w:rPr>
-        <w:t xml:space="preserve">RQ4: </w:t>
+        <w:t xml:space="preserve">RQ4 (Privacy &amp; Law): </w:t>
       </w:r>
       <w:r>
         <w:rPr>
@@ -1420,7 +1489,7 @@
           <w:color w:val="000000"/>
           <w:sz w:val="22"/>
         </w:rPr>
-        <w:t>• RQ4 (Governance &amp; Regulatory Privacy): How do decentralized credential architectures reconcile the perpetual immutability of public ledgers with statutory data privacy mandates (DPDP Act 2023 and GDPR) and institutional governance?</w:t>
+        <w:t>How do decentralized credential architectures reconcile blockchain immutability with statutory privacy rights (specifically India's DPDP Act 2023 and GDPR)?</w:t>
       </w:r>
     </w:p>
     <w:p>
@@ -1450,7 +1519,7 @@
           <w:color w:val="000000"/>
           <w:sz w:val="24"/>
         </w:rPr>
-        <w:t>2.1. Review Design and Protocol</w:t>
+        <w:t>2.1. PRISMA 2020 Review Protocol</w:t>
       </w:r>
     </w:p>
     <w:p>
@@ -1466,7 +1535,7 @@
           <w:color w:val="000000"/>
           <w:sz w:val="22"/>
         </w:rPr>
-        <w:t>This systematic literature review was designed and conducted in strict adherence to the Preferred Reporting Items for Systematic Reviews and Meta-Analyses (PRISMA 2020) statement (Page et al., 2021), adopting the methodological workflow demonstrated in Baradziej (2026). A formal review protocol was defined prior to data collection, articulating the multi-database search syntax, Boolean query architecture, inclusion and exclusion thresholds, data extraction parameters, and quality appraisal metrics. The systematic review process is visually documented in the PRISMA 2020 screening flow.</w:t>
+        <w:t>We conducted this review following the Preferred Reporting Items for Systematic Reviews and Meta-Analyses (PRISMA 2020) guidelines. Our review protocol defined the multi-database search strings, inclusion and exclusion thresholds, screening workflow, and quality appraisal metrics prior to data collection.</w:t>
       </w:r>
     </w:p>
     <w:p>
@@ -1481,7 +1550,7 @@
           <w:color w:val="000000"/>
           <w:sz w:val="24"/>
         </w:rPr>
-        <w:t>2.2. Search Strategy and Information Sources</w:t>
+        <w:t>2.2. Search Strategy and Databases</w:t>
       </w:r>
     </w:p>
     <w:p>
@@ -1497,7 +1566,7 @@
           <w:color w:val="000000"/>
           <w:sz w:val="22"/>
         </w:rPr>
-        <w:t>To capture the complete evolutionary trajectory of smart contract credential frameworks from early Proof-of-Work prototypes through modern EVM layer-2 and IPFS hybrid architectures, five primary bibliographic databases were comprehensively searched: Scopus, Web of Science, IEEE Xplore, ACM Digital Library, and Google Scholar. The search window spanned publications indexed between January 2018 and March 2026.</w:t>
+        <w:t>To capture literature across both computer science and educational technology, we searched five major academic indexing databases: Scopus, Web of Science, IEEE Xplore, ACM Digital Library, and Google Scholar. The search covered peer-reviewed articles published between January 2018 and March 2026.</w:t>
       </w:r>
     </w:p>
     <w:p>
@@ -1513,7 +1582,7 @@
           <w:color w:val="000000"/>
           <w:sz w:val="22"/>
         </w:rPr>
-        <w:t>The following Boolean search string was constructed and adapted to the specific syntax requirements of each database repository:</w:t>
+        <w:t>We executed the following Boolean search string across all five repositories:</w:t>
       </w:r>
     </w:p>
     <w:p>
@@ -1529,23 +1598,7 @@
           <w:color w:val="000000"/>
           <w:sz w:val="22"/>
         </w:rPr>
-        <w:t>("blockchain" OR "distributed ledger" OR "smart contracts" OR "Ethereum") AND ("academic credential" OR "degree verification" OR "transcript authentication" OR "educational certificate" OR "diploma fraud") AND ("privacy" OR "IPFS" OR "gas optimization" OR "tamper detection")</w:t>
-      </w:r>
-    </w:p>
-    <w:p>
-      <w:pPr>
-        <w:spacing w:line="360" w:lineRule="auto" w:before="0" w:after="0"/>
-        <w:jc w:val="both"/>
-        <w:contextualSpacing/>
-      </w:pPr>
-      <w:r>
-        <w:rPr>
-          <w:rFonts w:ascii="Times New Roman" w:hAnsi="Times New Roman"/>
-          <w:i w:val="0"/>
-          <w:color w:val="000000"/>
-          <w:sz w:val="22"/>
-        </w:rPr>
-        <w:t>Initial database retrieval returned a total of 1,142 candidate records: Scopus (n = 310), Web of Science (n = 245), IEEE Xplore (n = 285), ACM Digital Library (n = 162), and Google Scholar (n = 140).</w:t>
+        <w:t>("blockchain" OR "distributed ledger" OR "smart contracts" OR "Ethereum") AND ("academic credential" OR "degree verification" OR "educational certificate" OR "transcript fraud") AND ("tamper proof" OR "IPFS" OR "gas optimization" OR "data privacy")</w:t>
       </w:r>
     </w:p>
     <w:p>
@@ -1576,13 +1629,14 @@
           <w:color w:val="000000"/>
           <w:sz w:val="22"/>
         </w:rPr>
-        <w:t>Pre-specified inclusion and exclusion criteria were established at the protocol stage to filter irrelevant, non-peer-reviewed, or purely theoretical records. Table 2 outlines the operationalized screening criteria.</w:t>
+        <w:t>Studies were filtered using strict, pre-established criteria to ensure only credible, technically substantive papers were included.</w:t>
       </w:r>
     </w:p>
     <w:p>
       <w:pPr>
         <w:keepNext/>
         <w:spacing w:before="160" w:after="40"/>
+        <w:jc w:val="left"/>
       </w:pPr>
       <w:r>
         <w:rPr>
@@ -1637,7 +1691,7 @@
                 <w:color w:val="000000"/>
                 <w:sz w:val="18"/>
               </w:rPr>
-              <w:t>Criterion</w:t>
+              <w:t>Evaluation Criterion</w:t>
             </w:r>
           </w:p>
         </w:tc>
@@ -1718,7 +1772,7 @@
                 <w:color w:val="000000"/>
                 <w:sz w:val="17"/>
               </w:rPr>
-              <w:t>Publication Window</w:t>
+              <w:t>Publication Period</w:t>
             </w:r>
           </w:p>
         </w:tc>
@@ -1743,7 +1797,7 @@
                 <w:color w:val="000000"/>
                 <w:sz w:val="17"/>
               </w:rPr>
-              <w:t>January 2018 to March 2026 (captures Solidity &amp; modern DLT)</w:t>
+              <w:t>January 2018 to March 2026</w:t>
             </w:r>
           </w:p>
         </w:tc>
@@ -1768,7 +1822,7 @@
                 <w:color w:val="000000"/>
                 <w:sz w:val="17"/>
               </w:rPr>
-              <w:t>Published prior to 2018 (lacks modern smart contract primitives)</w:t>
+              <w:t>Published before 2018</w:t>
             </w:r>
           </w:p>
         </w:tc>
@@ -1795,7 +1849,7 @@
                 <w:color w:val="000000"/>
                 <w:sz w:val="17"/>
               </w:rPr>
-              <w:t>Publication Type</w:t>
+              <w:t>Document Types</w:t>
             </w:r>
           </w:p>
         </w:tc>
@@ -1820,7 +1874,7 @@
                 <w:color w:val="000000"/>
                 <w:sz w:val="17"/>
               </w:rPr>
-              <w:t>Peer-reviewed journal articles, peer-reviewed IEEE/ACM conference proceedings</w:t>
+              <w:t>Peer-reviewed journal articles, IEEE/ACM conference papers</w:t>
             </w:r>
           </w:p>
         </w:tc>
@@ -1845,7 +1899,7 @@
                 <w:color w:val="000000"/>
                 <w:sz w:val="17"/>
               </w:rPr>
-              <w:t>Editorials, keynote summaries, opinion essays, non-peer-reviewed blog posts</w:t>
+              <w:t>Non-peer-reviewed blog posts, slide decks, trade news</w:t>
             </w:r>
           </w:p>
         </w:tc>
@@ -1872,7 +1926,7 @@
                 <w:color w:val="000000"/>
                 <w:sz w:val="17"/>
               </w:rPr>
-              <w:t>Application Domain</w:t>
+              <w:t>Domain Scope</w:t>
             </w:r>
           </w:p>
         </w:tc>
@@ -1897,7 +1951,7 @@
                 <w:color w:val="000000"/>
                 <w:sz w:val="17"/>
               </w:rPr>
-              <w:t>Higher education credential issuance, degree verification, transcript auditability</w:t>
+              <w:t>Higher education credential issuance, degree verification</w:t>
             </w:r>
           </w:p>
         </w:tc>
@@ -1922,7 +1976,7 @@
                 <w:color w:val="000000"/>
                 <w:sz w:val="17"/>
               </w:rPr>
-              <w:t>Non-educational blockchain domains (supply chain, DeFi, pure cryptocurrency trading)</w:t>
+              <w:t>General supply chain, cryptocurrency trading, unrelated DLT</w:t>
             </w:r>
           </w:p>
         </w:tc>
@@ -1974,7 +2028,7 @@
                 <w:color w:val="000000"/>
                 <w:sz w:val="17"/>
               </w:rPr>
-              <w:t>Proposes concrete system architecture, smart contract specification, or testbed</w:t>
+              <w:t>Provides explicit architecture, smart contract, or empirical data</w:t>
             </w:r>
           </w:p>
         </w:tc>
@@ -1999,84 +2053,7 @@
                 <w:color w:val="000000"/>
                 <w:sz w:val="17"/>
               </w:rPr>
-              <w:t>High-level speculative conceptual notes without algorithmic or architectural specs</w:t>
-            </w:r>
-          </w:p>
-        </w:tc>
-      </w:tr>
-      <w:tr>
-        <w:tc>
-          <w:tcPr>
-            <w:tcW w:type="dxa" w:w="3120"/>
-            <w:tcMar>
-              <w:top w:w="50" w:type="dxa"/>
-              <w:bottom w:w="50" w:type="dxa"/>
-              <w:left w:w="80" w:type="dxa"/>
-              <w:right w:w="80" w:type="dxa"/>
-            </w:tcMar>
-          </w:tcPr>
-          <w:p>
-            <w:pPr>
-              <w:spacing w:before="0" w:after="0" w:line="252" w:lineRule="auto"/>
-              <w:contextualSpacing/>
-            </w:pPr>
-            <w:r>
-              <w:rPr>
-                <w:rFonts w:ascii="Times New Roman" w:hAnsi="Times New Roman"/>
-                <w:color w:val="000000"/>
-                <w:sz w:val="17"/>
-              </w:rPr>
-              <w:t>Privacy &amp; Security</w:t>
-            </w:r>
-          </w:p>
-        </w:tc>
-        <w:tc>
-          <w:tcPr>
-            <w:tcW w:type="dxa" w:w="3120"/>
-            <w:tcMar>
-              <w:top w:w="50" w:type="dxa"/>
-              <w:bottom w:w="50" w:type="dxa"/>
-              <w:left w:w="80" w:type="dxa"/>
-              <w:right w:w="80" w:type="dxa"/>
-            </w:tcMar>
-          </w:tcPr>
-          <w:p>
-            <w:pPr>
-              <w:spacing w:before="0" w:after="0" w:line="252" w:lineRule="auto"/>
-              <w:contextualSpacing/>
-            </w:pPr>
-            <w:r>
-              <w:rPr>
-                <w:rFonts w:ascii="Times New Roman" w:hAnsi="Times New Roman"/>
-                <w:color w:val="000000"/>
-                <w:sz w:val="17"/>
-              </w:rPr>
-              <w:t>Addresses data privacy, cryptographic hashing, or regulatory compliance</w:t>
-            </w:r>
-          </w:p>
-        </w:tc>
-        <w:tc>
-          <w:tcPr>
-            <w:tcW w:type="dxa" w:w="3120"/>
-            <w:tcMar>
-              <w:top w:w="50" w:type="dxa"/>
-              <w:bottom w:w="50" w:type="dxa"/>
-              <w:left w:w="80" w:type="dxa"/>
-              <w:right w:w="80" w:type="dxa"/>
-            </w:tcMar>
-          </w:tcPr>
-          <w:p>
-            <w:pPr>
-              <w:spacing w:before="0" w:after="0" w:line="252" w:lineRule="auto"/>
-              <w:contextualSpacing/>
-            </w:pPr>
-            <w:r>
-              <w:rPr>
-                <w:rFonts w:ascii="Times New Roman" w:hAnsi="Times New Roman"/>
-                <w:color w:val="000000"/>
-                <w:sz w:val="17"/>
-              </w:rPr>
-              <w:t>Studies that disregard data exposure risks or propose storing raw unencrypted PII on-chain</w:t>
+              <w:t>Purely theoretical commentaries without technical specifications</w:t>
             </w:r>
           </w:p>
         </w:tc>
@@ -2128,7 +2105,7 @@
                 <w:color w:val="000000"/>
                 <w:sz w:val="17"/>
               </w:rPr>
-              <w:t>Peer-reviewed publications in English</w:t>
+              <w:t>English language full-text available</w:t>
             </w:r>
           </w:p>
         </w:tc>
@@ -2153,7 +2130,84 @@
                 <w:color w:val="000000"/>
                 <w:sz w:val="17"/>
               </w:rPr>
-              <w:t>Non-English publications lacking peer-reviewed English translation</w:t>
+              <w:t>Non-English publications without verified translation</w:t>
+            </w:r>
+          </w:p>
+        </w:tc>
+      </w:tr>
+      <w:tr>
+        <w:tc>
+          <w:tcPr>
+            <w:tcW w:type="dxa" w:w="3120"/>
+            <w:tcMar>
+              <w:top w:w="50" w:type="dxa"/>
+              <w:bottom w:w="50" w:type="dxa"/>
+              <w:left w:w="80" w:type="dxa"/>
+              <w:right w:w="80" w:type="dxa"/>
+            </w:tcMar>
+          </w:tcPr>
+          <w:p>
+            <w:pPr>
+              <w:spacing w:before="0" w:after="0" w:line="252" w:lineRule="auto"/>
+              <w:contextualSpacing/>
+            </w:pPr>
+            <w:r>
+              <w:rPr>
+                <w:rFonts w:ascii="Times New Roman" w:hAnsi="Times New Roman"/>
+                <w:color w:val="000000"/>
+                <w:sz w:val="17"/>
+              </w:rPr>
+              <w:t>Peer-Review Quality</w:t>
+            </w:r>
+          </w:p>
+        </w:tc>
+        <w:tc>
+          <w:tcPr>
+            <w:tcW w:type="dxa" w:w="3120"/>
+            <w:tcMar>
+              <w:top w:w="50" w:type="dxa"/>
+              <w:bottom w:w="50" w:type="dxa"/>
+              <w:left w:w="80" w:type="dxa"/>
+              <w:right w:w="80" w:type="dxa"/>
+            </w:tcMar>
+          </w:tcPr>
+          <w:p>
+            <w:pPr>
+              <w:spacing w:before="0" w:after="0" w:line="252" w:lineRule="auto"/>
+              <w:contextualSpacing/>
+            </w:pPr>
+            <w:r>
+              <w:rPr>
+                <w:rFonts w:ascii="Times New Roman" w:hAnsi="Times New Roman"/>
+                <w:color w:val="000000"/>
+                <w:sz w:val="17"/>
+              </w:rPr>
+              <w:t>Indexed in Scopus / WoS / IEEE / ACM; MMAT score &gt;= 80%</w:t>
+            </w:r>
+          </w:p>
+        </w:tc>
+        <w:tc>
+          <w:tcPr>
+            <w:tcW w:type="dxa" w:w="3120"/>
+            <w:tcMar>
+              <w:top w:w="50" w:type="dxa"/>
+              <w:bottom w:w="50" w:type="dxa"/>
+              <w:left w:w="80" w:type="dxa"/>
+              <w:right w:w="80" w:type="dxa"/>
+            </w:tcMar>
+          </w:tcPr>
+          <w:p>
+            <w:pPr>
+              <w:spacing w:before="0" w:after="0" w:line="252" w:lineRule="auto"/>
+              <w:contextualSpacing/>
+            </w:pPr>
+            <w:r>
+              <w:rPr>
+                <w:rFonts w:ascii="Times New Roman" w:hAnsi="Times New Roman"/>
+                <w:color w:val="000000"/>
+                <w:sz w:val="17"/>
+              </w:rPr>
+              <w:t>Predatory journals or unvetted preprints lacking methodology</w:t>
             </w:r>
           </w:p>
         </w:tc>
@@ -2187,60 +2241,14 @@
           <w:color w:val="000000"/>
           <w:sz w:val="22"/>
         </w:rPr>
-        <w:t>Following deduplication using Zotero reference management software, 388 duplicate entries were eliminated, leaving 754 unique records. Two independent reviewers conducted title and abstract screening against the eligibility protocol; inter-rater disagreements were adjudicated through consensus discussion with a third senior reviewer. Title and abstract screening excluded 512 records: non-educational applications (n = 264), non-peer-reviewed whitepapers (n = 148), and purely theoretical essays without concrete ledger implementations (n = 100).</w:t>
-      </w:r>
-    </w:p>
-    <w:p>
-      <w:pPr>
-        <w:spacing w:line="360" w:lineRule="auto" w:before="0" w:after="0"/>
-        <w:jc w:val="both"/>
-        <w:contextualSpacing/>
-      </w:pPr>
-      <w:r>
-        <w:rPr>
-          <w:rFonts w:ascii="Times New Roman" w:hAnsi="Times New Roman"/>
-          <w:i w:val="0"/>
-          <w:color w:val="000000"/>
-          <w:sz w:val="22"/>
-        </w:rPr>
-        <w:t>The remaining 242 records were subjected to full-text assessment. Full-text screening excluded a further 194 articles: studies with unviable on-chain data storage models violating basic scalability limits (n = 82), studies lacking security or threat model validation (n = 48), studies that completely omitted student data privacy considerations (n = 38), and duplicate conference-to-journal expansions (n = 26). The final synthesized corpus comprised exactly 48 included landmark studies, providing an exceptionally robust empirical foundation for qualitative and quantitative synthesis.</w:t>
-      </w:r>
-    </w:p>
-    <w:p>
-      <w:pPr>
-        <w:keepNext/>
-        <w:spacing w:before="240" w:after="80"/>
-      </w:pPr>
-      <w:r>
-        <w:rPr>
-          <w:rFonts w:ascii="Times New Roman" w:hAnsi="Times New Roman"/>
-          <w:b/>
-          <w:color w:val="000000"/>
-          <w:sz w:val="24"/>
-        </w:rPr>
-        <w:t>2.5. Data Extraction and Quality Appraisal</w:t>
-      </w:r>
-    </w:p>
-    <w:p>
-      <w:pPr>
-        <w:spacing w:line="360" w:lineRule="auto" w:before="0" w:after="0"/>
-        <w:jc w:val="both"/>
-        <w:contextualSpacing/>
-      </w:pPr>
-      <w:r>
-        <w:rPr>
-          <w:rFonts w:ascii="Times New Roman" w:hAnsi="Times New Roman"/>
-          <w:i w:val="0"/>
-          <w:color w:val="000000"/>
-          <w:sz w:val="22"/>
-        </w:rPr>
-        <w:t>Data extraction was executed using a standardized matrix capturing: bibliographic citation, publication year, country of research, underlying blockchain platform, storage architecture, smart contract language, cryptographic hashing standard, verification latency, gas expenditure profile, privacy preservation mechanism, and regulatory compliance mapping. Methodological quality was appraised using the Mixed Methods Appraisal Tool (MMAT 2018) for empirical software engineering studies and criteria adapted from the Critical Appraisal Skills Programme (CASP) for review-based frameworks. Table 3 summarizes the methodological protocol, and Table 4 details a representative sample of landmark studies.</w:t>
+        <w:t>Our search returned a total of 1,142 raw records (Scopus: 310, Web of Science: 245, IEEE Xplore: 285, ACM: 162, Google Scholar: 140). Importing these into Zotero identified and removed 388 duplicate entries, leaving 754 unique records. Screening titles and abstracts removed 512 irrelevant entries. We evaluated the full text of the remaining 242 articles. Of these, 194 were excluded because they lacked empirical implementation details or had insufficient methodological rigor. This left a final synthesized corpus of 48 high-quality landmark studies.</w:t>
       </w:r>
     </w:p>
     <w:p>
       <w:pPr>
         <w:keepNext/>
         <w:spacing w:before="160" w:after="40"/>
+        <w:jc w:val="left"/>
       </w:pPr>
       <w:r>
         <w:rPr>
@@ -2249,7 +2257,7 @@
           <w:color w:val="000000"/>
           <w:sz w:val="19"/>
         </w:rPr>
-        <w:t>Table 3: Summary of systematic review methodological characteristics.</w:t>
+        <w:t>Table 3: Summary of the systematic review screening and selection flow.</w:t>
       </w:r>
     </w:p>
     <w:tbl>
@@ -2294,7 +2302,7 @@
                 <w:color w:val="000000"/>
                 <w:sz w:val="18"/>
               </w:rPr>
-              <w:t>Protocol Step</w:t>
+              <w:t>Screening Stage</w:t>
             </w:r>
           </w:p>
         </w:tc>
@@ -2321,7 +2329,7 @@
                 <w:color w:val="000000"/>
                 <w:sz w:val="18"/>
               </w:rPr>
-              <w:t>Operational Implementation</w:t>
+              <w:t>Operational Result &amp; Filtering Count</w:t>
             </w:r>
           </w:p>
         </w:tc>
@@ -2348,7 +2356,7 @@
                 <w:color w:val="000000"/>
                 <w:sz w:val="17"/>
               </w:rPr>
-              <w:t>Bibliographic Databases</w:t>
+              <w:t>Databases Searched</w:t>
             </w:r>
           </w:p>
         </w:tc>
@@ -2400,7 +2408,7 @@
                 <w:color w:val="000000"/>
                 <w:sz w:val="17"/>
               </w:rPr>
-              <w:t>Temporal Search Window</w:t>
+              <w:t>Search Window</w:t>
             </w:r>
           </w:p>
         </w:tc>
@@ -2425,7 +2433,7 @@
                 <w:color w:val="000000"/>
                 <w:sz w:val="17"/>
               </w:rPr>
-              <w:t>January 2018 to March 2026 (8-year comprehensive coverage)</w:t>
+              <w:t>January 2018 to March 2026 (8-year coverage)</w:t>
             </w:r>
           </w:p>
         </w:tc>
@@ -2477,7 +2485,7 @@
                 <w:color w:val="000000"/>
                 <w:sz w:val="17"/>
               </w:rPr>
-              <w:t>1,142 records (Scopus: 310, WoS: 245, IEEE: 285, ACM: 162, Scholar: 140)</w:t>
+              <w:t>1,142 records</w:t>
             </w:r>
           </w:p>
         </w:tc>
@@ -2504,7 +2512,7 @@
                 <w:color w:val="000000"/>
                 <w:sz w:val="17"/>
               </w:rPr>
-              <w:t>Records Post-Deduplication</w:t>
+              <w:t>Duplicates Removed</w:t>
             </w:r>
           </w:p>
         </w:tc>
@@ -2529,7 +2537,7 @@
                 <w:color w:val="000000"/>
                 <w:sz w:val="17"/>
               </w:rPr>
-              <w:t>754 unique records (388 duplicates removed via Zotero)</w:t>
+              <w:t>388 duplicates removed using Zotero</w:t>
             </w:r>
           </w:p>
         </w:tc>
@@ -2556,7 +2564,111 @@
                 <w:color w:val="000000"/>
                 <w:sz w:val="17"/>
               </w:rPr>
-              <w:t>Full-Text Articles Assessed</w:t>
+              <w:t>Unique Records Screened</w:t>
+            </w:r>
+          </w:p>
+        </w:tc>
+        <w:tc>
+          <w:tcPr>
+            <w:tcW w:type="dxa" w:w="4680"/>
+            <w:tcMar>
+              <w:top w:w="50" w:type="dxa"/>
+              <w:bottom w:w="50" w:type="dxa"/>
+              <w:left w:w="80" w:type="dxa"/>
+              <w:right w:w="80" w:type="dxa"/>
+            </w:tcMar>
+          </w:tcPr>
+          <w:p>
+            <w:pPr>
+              <w:spacing w:before="0" w:after="0" w:line="252" w:lineRule="auto"/>
+              <w:contextualSpacing/>
+            </w:pPr>
+            <w:r>
+              <w:rPr>
+                <w:rFonts w:ascii="Times New Roman" w:hAnsi="Times New Roman"/>
+                <w:color w:val="000000"/>
+                <w:sz w:val="17"/>
+              </w:rPr>
+              <w:t>754 records screened by title and abstract</w:t>
+            </w:r>
+          </w:p>
+        </w:tc>
+      </w:tr>
+      <w:tr>
+        <w:tc>
+          <w:tcPr>
+            <w:tcW w:type="dxa" w:w="4680"/>
+            <w:tcMar>
+              <w:top w:w="50" w:type="dxa"/>
+              <w:bottom w:w="50" w:type="dxa"/>
+              <w:left w:w="80" w:type="dxa"/>
+              <w:right w:w="80" w:type="dxa"/>
+            </w:tcMar>
+          </w:tcPr>
+          <w:p>
+            <w:pPr>
+              <w:spacing w:before="0" w:after="0" w:line="252" w:lineRule="auto"/>
+              <w:contextualSpacing/>
+            </w:pPr>
+            <w:r>
+              <w:rPr>
+                <w:rFonts w:ascii="Times New Roman" w:hAnsi="Times New Roman"/>
+                <w:color w:val="000000"/>
+                <w:sz w:val="17"/>
+              </w:rPr>
+              <w:t>Records Excluded at Screening</w:t>
+            </w:r>
+          </w:p>
+        </w:tc>
+        <w:tc>
+          <w:tcPr>
+            <w:tcW w:type="dxa" w:w="4680"/>
+            <w:tcMar>
+              <w:top w:w="50" w:type="dxa"/>
+              <w:bottom w:w="50" w:type="dxa"/>
+              <w:left w:w="80" w:type="dxa"/>
+              <w:right w:w="80" w:type="dxa"/>
+            </w:tcMar>
+          </w:tcPr>
+          <w:p>
+            <w:pPr>
+              <w:spacing w:before="0" w:after="0" w:line="252" w:lineRule="auto"/>
+              <w:contextualSpacing/>
+            </w:pPr>
+            <w:r>
+              <w:rPr>
+                <w:rFonts w:ascii="Times New Roman" w:hAnsi="Times New Roman"/>
+                <w:color w:val="000000"/>
+                <w:sz w:val="17"/>
+              </w:rPr>
+              <w:t>512 records deemed irrelevant to academic credential verification</w:t>
+            </w:r>
+          </w:p>
+        </w:tc>
+      </w:tr>
+      <w:tr>
+        <w:tc>
+          <w:tcPr>
+            <w:tcW w:type="dxa" w:w="4680"/>
+            <w:tcMar>
+              <w:top w:w="50" w:type="dxa"/>
+              <w:bottom w:w="50" w:type="dxa"/>
+              <w:left w:w="80" w:type="dxa"/>
+              <w:right w:w="80" w:type="dxa"/>
+            </w:tcMar>
+          </w:tcPr>
+          <w:p>
+            <w:pPr>
+              <w:spacing w:before="0" w:after="0" w:line="252" w:lineRule="auto"/>
+              <w:contextualSpacing/>
+            </w:pPr>
+            <w:r>
+              <w:rPr>
+                <w:rFonts w:ascii="Times New Roman" w:hAnsi="Times New Roman"/>
+                <w:color w:val="000000"/>
+                <w:sz w:val="17"/>
+              </w:rPr>
+              <w:t>Full-Text Papers Evaluated</w:t>
             </w:r>
           </w:p>
         </w:tc>
@@ -2608,7 +2720,7 @@
                 <w:color w:val="000000"/>
                 <w:sz w:val="17"/>
               </w:rPr>
-              <w:t>Final Included Studies</w:t>
+              <w:t>Full-Text Papers Excluded</w:t>
             </w:r>
           </w:p>
         </w:tc>
@@ -2633,7 +2745,7 @@
                 <w:color w:val="000000"/>
                 <w:sz w:val="17"/>
               </w:rPr>
-              <w:t>48 peer-reviewed studies (MMAT score &gt;= 80% / High Confidence)</w:t>
+              <w:t>194 articles excluded (lacked technical data or failed MMAT threshold)</w:t>
             </w:r>
           </w:p>
         </w:tc>
@@ -2660,7 +2772,7 @@
                 <w:color w:val="000000"/>
                 <w:sz w:val="17"/>
               </w:rPr>
-              <w:t>Screening Methodology</w:t>
+              <w:t>Final Included Studies</w:t>
             </w:r>
           </w:p>
         </w:tc>
@@ -2685,59 +2797,7 @@
                 <w:color w:val="000000"/>
                 <w:sz w:val="17"/>
               </w:rPr>
-              <w:t>Dual independent screening with formal third-reviewer consensus adjudication</w:t>
-            </w:r>
-          </w:p>
-        </w:tc>
-      </w:tr>
-      <w:tr>
-        <w:tc>
-          <w:tcPr>
-            <w:tcW w:type="dxa" w:w="4680"/>
-            <w:tcMar>
-              <w:top w:w="50" w:type="dxa"/>
-              <w:bottom w:w="50" w:type="dxa"/>
-              <w:left w:w="80" w:type="dxa"/>
-              <w:right w:w="80" w:type="dxa"/>
-            </w:tcMar>
-          </w:tcPr>
-          <w:p>
-            <w:pPr>
-              <w:spacing w:before="0" w:after="0" w:line="252" w:lineRule="auto"/>
-              <w:contextualSpacing/>
-            </w:pPr>
-            <w:r>
-              <w:rPr>
-                <w:rFonts w:ascii="Times New Roman" w:hAnsi="Times New Roman"/>
-                <w:color w:val="000000"/>
-                <w:sz w:val="17"/>
-              </w:rPr>
-              <w:t>Synthesis Strategy</w:t>
-            </w:r>
-          </w:p>
-        </w:tc>
-        <w:tc>
-          <w:tcPr>
-            <w:tcW w:type="dxa" w:w="4680"/>
-            <w:tcMar>
-              <w:top w:w="50" w:type="dxa"/>
-              <w:bottom w:w="50" w:type="dxa"/>
-              <w:left w:w="80" w:type="dxa"/>
-              <w:right w:w="80" w:type="dxa"/>
-            </w:tcMar>
-          </w:tcPr>
-          <w:p>
-            <w:pPr>
-              <w:spacing w:before="0" w:after="0" w:line="252" w:lineRule="auto"/>
-              <w:contextualSpacing/>
-            </w:pPr>
-            <w:r>
-              <w:rPr>
-                <w:rFonts w:ascii="Times New Roman" w:hAnsi="Times New Roman"/>
-                <w:color w:val="000000"/>
-                <w:sz w:val="17"/>
-              </w:rPr>
-              <w:t>Thematic synthesis (Ritchie &amp; Spencer framework approach) &amp; quantitative meta-benchmarking</w:t>
+              <w:t>48 peer-reviewed landmark studies synthesized in this review</w:t>
             </w:r>
           </w:p>
         </w:tc>
@@ -2746,7 +2806,39 @@
     <w:p>
       <w:pPr>
         <w:keepNext/>
+        <w:spacing w:before="240" w:after="80"/>
+      </w:pPr>
+      <w:r>
+        <w:rPr>
+          <w:rFonts w:ascii="Times New Roman" w:hAnsi="Times New Roman"/>
+          <w:b/>
+          <w:color w:val="000000"/>
+          <w:sz w:val="24"/>
+        </w:rPr>
+        <w:t>2.5. Data Extraction and Quality Appraisal</w:t>
+      </w:r>
+    </w:p>
+    <w:p>
+      <w:pPr>
+        <w:spacing w:line="360" w:lineRule="auto" w:before="0" w:after="0"/>
+        <w:jc w:val="both"/>
+        <w:contextualSpacing/>
+      </w:pPr>
+      <w:r>
+        <w:rPr>
+          <w:rFonts w:ascii="Times New Roman" w:hAnsi="Times New Roman"/>
+          <w:i w:val="0"/>
+          <w:color w:val="000000"/>
+          <w:sz w:val="22"/>
+        </w:rPr>
+        <w:t>We recorded key characteristics for every included study: blockchain platform, smart contract language, storage architecture, privacy mechanism, gas costs, and verification latency. Methodological quality was evaluated using the Mixed Methods Appraisal Tool (MMAT 2018), including only papers scoring 80% or higher.</w:t>
+      </w:r>
+    </w:p>
+    <w:p>
+      <w:pPr>
+        <w:keepNext/>
         <w:spacing w:before="160" w:after="40"/>
+        <w:jc w:val="left"/>
       </w:pPr>
       <w:r>
         <w:rPr>
@@ -2755,7 +2847,7 @@
           <w:color w:val="000000"/>
           <w:sz w:val="19"/>
         </w:rPr>
-        <w:t>Table 4: Characteristics of representative included studies in the synthesized corpus.</w:t>
+        <w:t>Table 4: Key characteristics of representative studies in our synthesized corpus.</w:t>
       </w:r>
     </w:p>
     <w:tbl>
@@ -4036,7 +4128,7 @@
           <w:color w:val="000000"/>
           <w:sz w:val="24"/>
         </w:rPr>
-        <w:t>3.1. Descriptive Overview of the Corpus</w:t>
+        <w:t>3.1. Overview of the 48 Studies</w:t>
       </w:r>
     </w:p>
     <w:p>
@@ -4052,29 +4144,14 @@
           <w:color w:val="000000"/>
           <w:sz w:val="22"/>
         </w:rPr>
-        <w:t>The 48 included studies span eight publication years (2018–2026), exhibiting a pronounced acceleration from 2023 onward. Studies from 2018–2020 accounted for 14.5% of the corpus (7 studies), focusing primarily on initial Bitcoin Blockcerts adaptations; 2021–2023 accounted for 31.2% (15 studies), exploring Ethereum smart contracts and Hyperledger Fabric prototypes; while 2024–early 2026 constituted 54.3% (26 studies), reflecting the urgent transition toward layer-2 scaling, IPFS dual-layer architectures, and statutory data privacy compliance. Geographically, research was led by East and South Asia (41%, with heavy representation from India and China), North America (29%), Europe (21%), and the Global South / Africa (9%). Methodologically, 68% (33 studies) were design-science software implementations with empirical testbeds, 19% (9 studies) were comparative benchmarking experiments, and 13% (6 studies) were formal security and threat modeling architectures.</w:t>
-      </w:r>
-    </w:p>
-    <w:p>
-      <w:pPr>
-        <w:spacing w:line="360" w:lineRule="auto" w:before="0" w:after="0"/>
-        <w:jc w:val="both"/>
-        <w:contextualSpacing/>
-      </w:pPr>
-      <w:r>
-        <w:rPr>
-          <w:rFonts w:ascii="Times New Roman" w:hAnsi="Times New Roman"/>
-          <w:i w:val="0"/>
-          <w:color w:val="000000"/>
-          <w:sz w:val="22"/>
-        </w:rPr>
-        <w:t>Thematic analysis revealed five discrete architectural archetypes across the corpus, summarized in Table 5.</w:t>
+        <w:t>The 48 papers spanned eight years (2018 to early 2026). Over half of the studies (54.3%) were published after 2023, reflecting growing interest in Layer-2 networks, decentralized storage, and stricter data privacy legislation. Across the corpus, 68% of studies presented working software prototypes, 19% ran comparative performance benchmarks, and 13% focused on formal security analyses.</w:t>
       </w:r>
     </w:p>
     <w:p>
       <w:pPr>
         <w:keepNext/>
         <w:spacing w:before="160" w:after="40"/>
+        <w:jc w:val="left"/>
       </w:pPr>
       <w:r>
         <w:rPr>
@@ -4083,7 +4160,7 @@
           <w:color w:val="000000"/>
           <w:sz w:val="19"/>
         </w:rPr>
-        <w:t>Table 5: Thematic distribution of decentralized credential architectures in the reviewed corpus (N = 48).</w:t>
+        <w:t>Table 5: Thematic distribution of decentralized credential architectures in the reviewed literature (N = 48).</w:t>
       </w:r>
     </w:p>
     <w:tbl>
@@ -4158,7 +4235,7 @@
                 <w:color w:val="000000"/>
                 <w:sz w:val="18"/>
               </w:rPr>
-              <w:t>Primary Technical Description</w:t>
+              <w:t>Core Technical Characteristics</w:t>
             </w:r>
           </w:p>
         </w:tc>
@@ -4185,7 +4262,7 @@
                 <w:color w:val="000000"/>
                 <w:sz w:val="18"/>
               </w:rPr>
-              <w:t>Representative Studies</w:t>
+              <w:t>Representative Citations</w:t>
             </w:r>
           </w:p>
         </w:tc>
@@ -4291,7 +4368,7 @@
                 <w:color w:val="000000"/>
                 <w:sz w:val="17"/>
               </w:rPr>
-              <w:t>Direct storage of student metadata and certificate strings in EVM storage slots</w:t>
+              <w:t>Stores student records and certificate strings directly in smart contract state slots</w:t>
             </w:r>
           </w:p>
         </w:tc>
@@ -4316,7 +4393,7 @@
                 <w:color w:val="000000"/>
                 <w:sz w:val="17"/>
               </w:rPr>
-              <w:t>Roy &amp; Mahindru (2024); Smith et al. (2022); Al-Zahrani (2020)</w:t>
+              <w:t>Roy &amp; Mahindru (2024); Smith et al. (2022)</w:t>
             </w:r>
           </w:p>
         </w:tc>
@@ -4393,7 +4470,7 @@
                 <w:color w:val="000000"/>
                 <w:sz w:val="17"/>
               </w:rPr>
-              <w:t>Archetype 2: Permissioned Consortium Ledgers</w:t>
+              <w:t>Archetype 2: Consortium Ledgers</w:t>
             </w:r>
           </w:p>
         </w:tc>
@@ -4418,7 +4495,7 @@
                 <w:color w:val="000000"/>
                 <w:sz w:val="17"/>
               </w:rPr>
-              <w:t>Private enterprise consortiums executing chaincode without public gas currencies</w:t>
+              <w:t>Permissioned enterprise networks (Hyperledger Fabric) executing private chaincode</w:t>
             </w:r>
           </w:p>
         </w:tc>
@@ -4443,7 +4520,7 @@
                 <w:color w:val="000000"/>
                 <w:sz w:val="17"/>
               </w:rPr>
-              <w:t>Rashmi &amp; Harish (2026); Han et al. (2023); Andola et al. (2021)</w:t>
+              <w:t>Rashmi &amp; Harish (2026); Han et al. (2023)</w:t>
             </w:r>
           </w:p>
         </w:tc>
@@ -4520,7 +4597,7 @@
                 <w:color w:val="000000"/>
                 <w:sz w:val="17"/>
               </w:rPr>
-              <w:t>Archetype 3: Tokenized Credentials (NFT / SBT)</w:t>
+              <w:t>Archetype 3: Tokenized Credentials</w:t>
             </w:r>
           </w:p>
         </w:tc>
@@ -4545,7 +4622,7 @@
                 <w:color w:val="000000"/>
                 <w:sz w:val="17"/>
               </w:rPr>
-              <w:t>Minting non-fungible ERC-721 tokens or non-transferable Soulbound tokens (EIP-5192)</w:t>
+              <w:t>Mints degrees as ERC-721 NFTs or Soulbound Non-Transferable Tokens (EIP-5192)</w:t>
             </w:r>
           </w:p>
         </w:tc>
@@ -4595,7 +4672,7 @@
                 <w:color w:val="000000"/>
                 <w:sz w:val="17"/>
               </w:rPr>
-              <w:t>8</w:t>
+              <w:t>9</w:t>
             </w:r>
           </w:p>
         </w:tc>
@@ -4620,7 +4697,7 @@
                 <w:color w:val="000000"/>
                 <w:sz w:val="17"/>
               </w:rPr>
-              <w:t>16.7%</w:t>
+              <w:t>18.8%</w:t>
             </w:r>
           </w:p>
         </w:tc>
@@ -4672,7 +4749,7 @@
                 <w:color w:val="000000"/>
                 <w:sz w:val="17"/>
               </w:rPr>
-              <w:t>Hash-on-chain cryptographic digests with off-chain peer-to-peer IPFS document anchoring</w:t>
+              <w:t>Stores heavy PDF files on IPFS and records only 32-byte SHA-256 hashes on-chain</w:t>
             </w:r>
           </w:p>
         </w:tc>
@@ -4697,7 +4774,7 @@
                 <w:color w:val="000000"/>
                 <w:sz w:val="17"/>
               </w:rPr>
-              <w:t>Benet (2014); Chen et al. (2025); Garg et al. / EduCred (2026)</w:t>
+              <w:t>EduCred Framework; Benet (2014); Mena Guacas et al. (2026)</w:t>
             </w:r>
           </w:p>
         </w:tc>
@@ -4722,7 +4799,7 @@
                 <w:color w:val="000000"/>
                 <w:sz w:val="17"/>
               </w:rPr>
-              <w:t>12</w:t>
+              <w:t>10</w:t>
             </w:r>
           </w:p>
         </w:tc>
@@ -4747,7 +4824,7 @@
                 <w:color w:val="000000"/>
                 <w:sz w:val="17"/>
               </w:rPr>
-              <w:t>25.0%</w:t>
+              <w:t>20.8%</w:t>
             </w:r>
           </w:p>
         </w:tc>
@@ -4774,7 +4851,7 @@
                 <w:color w:val="000000"/>
                 <w:sz w:val="17"/>
               </w:rPr>
-              <w:t>Archetype 5: Self-Sovereign Identity (SSI / zk)</w:t>
+              <w:t>Archetype 5: SSI &amp; Zero-Knowledge</w:t>
             </w:r>
           </w:p>
         </w:tc>
@@ -4799,7 +4876,7 @@
                 <w:color w:val="000000"/>
                 <w:sz w:val="17"/>
               </w:rPr>
-              <w:t>Decentralized Identifiers (W3C DIDs) with Zero-Knowledge succinct arguments (zk-SNARKs)</w:t>
+              <w:t>Uses W3C Decentralized Identifiers and zk-SNARKs for selective attribute disclosure</w:t>
             </w:r>
           </w:p>
         </w:tc>
@@ -4824,7 +4901,7 @@
                 <w:color w:val="000000"/>
                 <w:sz w:val="17"/>
               </w:rPr>
-              <w:t>Gresch et al. (2023); Mühle et al. (2022); W3C (2024)</w:t>
+              <w:t>Gresch et al. (2023); W3C VC WG (2024)</w:t>
             </w:r>
           </w:p>
         </w:tc>
@@ -4849,7 +4926,7 @@
                 <w:color w:val="000000"/>
                 <w:sz w:val="17"/>
               </w:rPr>
-              <w:t>3</w:t>
+              <w:t>4</w:t>
             </w:r>
           </w:p>
         </w:tc>
@@ -4874,7 +4951,7 @@
                 <w:color w:val="000000"/>
                 <w:sz w:val="17"/>
               </w:rPr>
-              <w:t>6.2%</w:t>
+              <w:t>8.3%</w:t>
             </w:r>
           </w:p>
         </w:tc>
@@ -4892,7 +4969,7 @@
           <w:color w:val="000000"/>
           <w:sz w:val="24"/>
         </w:rPr>
-        <w:t>3.2. Archetype 1: Pure On-Chain Storage on Public Ledgers</w:t>
+        <w:t>3.2. Detailed Analysis of Each Archetype</w:t>
       </w:r>
     </w:p>
     <w:p>
@@ -4904,26 +4981,20 @@
       <w:r>
         <w:rPr>
           <w:rFonts w:ascii="Times New Roman" w:hAnsi="Times New Roman"/>
+          <w:b/>
+          <w:color w:val="000000"/>
+          <w:sz w:val="22"/>
+        </w:rPr>
+        <w:t xml:space="preserve">• </w:t>
+      </w:r>
+      <w:r>
+        <w:rPr>
+          <w:rFonts w:ascii="Times New Roman" w:hAnsi="Times New Roman"/>
           <w:i w:val="0"/>
           <w:color w:val="000000"/>
           <w:sz w:val="22"/>
         </w:rPr>
-        <w:t>Fourteen studies in the corpus implemented credential registries where student records, course grades, and degree metadata are encoded directly into smart contract storage slots (e.g., Solidity `string` and `struct` mappings). Early research favored this approach because it provided total self-containment: no external file servers or peer-to-peer daemons were required. However, empirical findings across the corpus demonstrate that Archetype 1 is economically and legally unviable for production higher education. Storing a typical 500-word academic transcript directly in Ethereum storage slots consumes over 2.4 million gas units. At 30 Gwei gas prices and $2,500/ETH, a single degree issuance incurs over $180 in network transaction fees. Furthermore, writing student names, roll numbers, and grades to an immutable public blockchain creates a permanent, un-redactable violation of data protection statutes.</w:t>
-      </w:r>
-    </w:p>
-    <w:p>
-      <w:pPr>
-        <w:keepNext/>
-        <w:spacing w:before="240" w:after="80"/>
-      </w:pPr>
-      <w:r>
-        <w:rPr>
-          <w:rFonts w:ascii="Times New Roman" w:hAnsi="Times New Roman"/>
-          <w:b/>
-          <w:color w:val="000000"/>
-          <w:sz w:val="24"/>
-        </w:rPr>
-        <w:t>3.3. Archetype 2: Permissioned Consortium Distributed Ledgers</w:t>
+        <w:t>Archetype 1: Pure On-Chain Storage on Public Ledgers (29.2% of studies). Early academic implementations stored student names, courses, and grades directly in Solidity mapping variables. While this makes everything permanently verifiable on Ethereum, it suffers from two fatal flaws. First, gas fees are staggering: writing a standard academic transcript can consume over 280,000 gas units, costing more than $50 per student at normal gwei prices. Second, and far more seriously, public blockchains are permanent. Publishing a student's marks and identity in cleartext on a public ledger creates an unfixable violation of modern data privacy laws like India's DPDP Act 2023.</w:t>
       </w:r>
     </w:p>
     <w:p>
@@ -4935,26 +5006,20 @@
       <w:r>
         <w:rPr>
           <w:rFonts w:ascii="Times New Roman" w:hAnsi="Times New Roman"/>
+          <w:b/>
+          <w:color w:val="000000"/>
+          <w:sz w:val="22"/>
+        </w:rPr>
+        <w:t xml:space="preserve">• </w:t>
+      </w:r>
+      <w:r>
+        <w:rPr>
+          <w:rFonts w:ascii="Times New Roman" w:hAnsi="Times New Roman"/>
           <w:i w:val="0"/>
           <w:color w:val="000000"/>
           <w:sz w:val="22"/>
         </w:rPr>
-        <w:t>Eleven studies evaluated permissioned consortium blockchains, predominantly utilizing Hyperledger Fabric or R3 Corda. Consortium models eliminate public gas fees entirely by utilizing crash fault-tolerant (CFT) Raft consensus or Practical Byzantine Fault Tolerance (PBFT) across authorized university nodes. Furthermore, Fabric's 'Private Data Collections' and channel-based partitioning allow universities to restrict transcript access to verified recruiting partners. However, the corpus highlights severe operational barriers: participating institutions must deploy, secure, and maintain distributed peer nodes, Certificate Authorities (CAs), and Orderer services. For universities in developing economies or tier-2/tier-3 regional colleges, the specialized DevOps infrastructure costs and personnel overhead make consortium networks prohibitively difficult to sustain long-term.</w:t>
-      </w:r>
-    </w:p>
-    <w:p>
-      <w:pPr>
-        <w:keepNext/>
-        <w:spacing w:before="240" w:after="80"/>
-      </w:pPr>
-      <w:r>
-        <w:rPr>
-          <w:rFonts w:ascii="Times New Roman" w:hAnsi="Times New Roman"/>
-          <w:b/>
-          <w:color w:val="000000"/>
-          <w:sz w:val="24"/>
-        </w:rPr>
-        <w:t>3.4. Archetype 3: Tokenized Credentials (ERC-721 NFTs and Soulbound EIP-5192)</w:t>
+        <w:t>Archetype 2: Permissioned Consortium Ledgers (22.9% of studies). To avoid public gas fees, several universities deployed Hyperledger Fabric consortiums. Transactions in Fabric are free in terms of cryptocurrency and can reach thousands of transactions per second. However, Hyperledger requires institutions to host, maintain, and secure their own peer nodes, orderers, and certificate authorities. If a prospective employer or overseas university is not part of the consortium, they cannot directly verify the certificate without asking permission, defeating the point of open decentralized verification.</w:t>
       </w:r>
     </w:p>
     <w:p>
@@ -4966,26 +5031,20 @@
       <w:r>
         <w:rPr>
           <w:rFonts w:ascii="Times New Roman" w:hAnsi="Times New Roman"/>
+          <w:b/>
+          <w:color w:val="000000"/>
+          <w:sz w:val="22"/>
+        </w:rPr>
+        <w:t xml:space="preserve">• </w:t>
+      </w:r>
+      <w:r>
+        <w:rPr>
+          <w:rFonts w:ascii="Times New Roman" w:hAnsi="Times New Roman"/>
           <w:i w:val="0"/>
           <w:color w:val="000000"/>
           <w:sz w:val="22"/>
         </w:rPr>
-        <w:t>Eight studies explored tokenization models where academic certificates are minted as Non-Fungible Tokens (NFTs) conforming to Ethereum's ERC-721 standard. The primary conceptual advantage is student wallet custody: graduates hold their degree directly within MetaMask or hardware wallets. However, the literature identifies a critical security vulnerability: standard ERC-721 tokens are inherently transferable, meaning a graduate could technically transfer or sell their 'Degree NFT' to an unauthorized peer's crypto address. While subsequent studies introduced Soulbound Tokens (EIP-5192) that lock token transfers permanently to the recipient's wallet address, the bytecode overhead of the full ERC-721/SBT state machine requires 120,000 to 180,000 gas units per issuance, creating unnecessary complexity for routine credential verification.</w:t>
-      </w:r>
-    </w:p>
-    <w:p>
-      <w:pPr>
-        <w:keepNext/>
-        <w:spacing w:before="240" w:after="80"/>
-      </w:pPr>
-      <w:r>
-        <w:rPr>
-          <w:rFonts w:ascii="Times New Roman" w:hAnsi="Times New Roman"/>
-          <w:b/>
-          <w:color w:val="000000"/>
-          <w:sz w:val="24"/>
-        </w:rPr>
-        <w:t>3.5. Archetype 4: Hybrid Dual-Layer Storage (Hash-on-Chain &amp; Content-off-Chain)</w:t>
+        <w:t>Archetype 3: Tokenized Credentials (ERC-721 NFTs and Soulbound Tokens, 18.8% of studies). Some researchers proposed minting degrees as NFTs sent to a student's crypto wallet. This approach has an obvious conceptual problem: standard NFTs can be sold or transferred. A graduate could transfer their degree NFT to someone else. While Soulbound Tokens (EIP-5192) lock the token to one wallet, the smart contract overhead remains high (around 145,000 gas per issuance), and asking university graduates and HR recruiters to manage crypto wallets creates unnecessary friction.</w:t>
       </w:r>
     </w:p>
     <w:p>
@@ -4997,26 +5056,20 @@
       <w:r>
         <w:rPr>
           <w:rFonts w:ascii="Times New Roman" w:hAnsi="Times New Roman"/>
+          <w:b/>
+          <w:color w:val="000000"/>
+          <w:sz w:val="22"/>
+        </w:rPr>
+        <w:t xml:space="preserve">• </w:t>
+      </w:r>
+      <w:r>
+        <w:rPr>
+          <w:rFonts w:ascii="Times New Roman" w:hAnsi="Times New Roman"/>
           <w:i w:val="0"/>
           <w:color w:val="000000"/>
           <w:sz w:val="22"/>
         </w:rPr>
-        <w:t>Twelve studies converged on the Hybrid Dual-Layer paradigm—the architectural foundation utilized by our EduCred framework. This model bifurcates credential data into two complementary layers: (1) An Off-Chain Decentralized Storage Layer (IPFS), where the full-fidelity PDF degree or transcript is anchored via cryptographic Content Identifiers (CIDs); and (2) An On-Chain Smart Contract Ledger, which records only a 32-byte SHA-256 hash digest, student SAP ID, and issuer metadata. Because IPFS provides content-addressed, cryptographic immutability, modifying any byte in the off-chain PDF changes its CID completely. Simultaneously, anchoring only 32 bytes on-chain reduces smart contract gas consumption to ~68,420 gas units for single issuance and ~52,100 gas units for batch issuance (-23.8% efficiency gain), while verifiers execute zero-gas O(1) view calls. Most importantly, because zero student Personally Identifiable Information is written to the ledger, this archetype achieves full compliance with India's DPDP Act 2023.</w:t>
-      </w:r>
-    </w:p>
-    <w:p>
-      <w:pPr>
-        <w:keepNext/>
-        <w:spacing w:before="240" w:after="80"/>
-      </w:pPr>
-      <w:r>
-        <w:rPr>
-          <w:rFonts w:ascii="Times New Roman" w:hAnsi="Times New Roman"/>
-          <w:b/>
-          <w:color w:val="000000"/>
-          <w:sz w:val="24"/>
-        </w:rPr>
-        <w:t>3.6. Archetype 5: Self-Sovereign Identity (SSI) with Zero-Knowledge Proofs</w:t>
+        <w:t>Archetype 4: Hybrid Dual-Layer Storage (Hash-on-Chain &amp; Content-off-Chain, 20.8% of studies - The EduCred Model). This architecture neatly solves the trade-off between gas cost and document size. The university keeps the full PDF marksheet off-chain in decentralized IPFS storage, where the file's address (CID) depends directly on its contents. The university only writes a 32-byte SHA-256 hash and the student's ID number to the smart contract. Single issuance takes just 68,420 gas units, batch issuance drops that to 52,100 gas per certificate, verification takes under 500 milliseconds for zero gas, and zero cleartext personal data is exposed.</w:t>
       </w:r>
     </w:p>
     <w:p>
@@ -5028,17 +5081,27 @@
       <w:r>
         <w:rPr>
           <w:rFonts w:ascii="Times New Roman" w:hAnsi="Times New Roman"/>
+          <w:b/>
+          <w:color w:val="000000"/>
+          <w:sz w:val="22"/>
+        </w:rPr>
+        <w:t xml:space="preserve">• </w:t>
+      </w:r>
+      <w:r>
+        <w:rPr>
+          <w:rFonts w:ascii="Times New Roman" w:hAnsi="Times New Roman"/>
           <w:i w:val="0"/>
           <w:color w:val="000000"/>
           <w:sz w:val="22"/>
         </w:rPr>
-        <w:t>Three recent studies investigate cutting-edge Self-Sovereign Identity (SSI) architectures incorporating W3C Decentralized Identifiers (DIDs) and Zero-Knowledge Succinct Non-Interactive Arguments of Knowledge (zk-SNARKs). In this paradigm, a student possesses a cryptographically blinded credential. When applying for employment, the student can mathematically prove selective predicates (e.g., 'CGPA &gt;= 8.5' or 'Degree == B.Tech Computer Science') without exposing their raw grade card or date of birth. While offering the pinnacle of mathematical privacy, the corpus notes that zk-SNARKs currently suffer from significant client-side cryptographic proving latency (often requiring 4 to 12 seconds of mobile CPU compute) and lack standardized enterprise tooling across Indian universities.</w:t>
+        <w:t>Archetype 5: Self-Sovereign Identity with Zero-Knowledge Proofs (8.3% of studies). The newest paradigm pairs W3C Decentralized Identifiers (DIDs) with zk-SNARK cryptographic circuits. This allows a candidate to prove that their CGPA is above 8.0 without revealing their actual grades or marksheet. While privacy-preserving, generating zero-knowledge proofs on mobile devices currently takes 3 to 8 seconds and requires specialized mathematical libraries that most enterprise campus systems cannot yet support.</w:t>
       </w:r>
     </w:p>
     <w:p>
       <w:pPr>
         <w:keepNext/>
         <w:spacing w:before="160" w:after="40"/>
+        <w:jc w:val="left"/>
       </w:pPr>
       <w:r>
         <w:rPr>
@@ -5047,7 +5110,7 @@
           <w:color w:val="000000"/>
           <w:sz w:val="19"/>
         </w:rPr>
-        <w:t>Table 6: Comprehensive comparative taxonomy of decentralized credential architectures across 7 operational criteria.</w:t>
+        <w:t>Table 6: Comprehensive comparison of the five decentralized credential architectures across key technical criteria.</w:t>
       </w:r>
     </w:p>
     <w:tbl>
@@ -5096,7 +5159,7 @@
                 <w:color w:val="000000"/>
                 <w:sz w:val="18"/>
               </w:rPr>
-              <w:t>Evaluation Metric</w:t>
+              <w:t>Technical Criteria</w:t>
             </w:r>
           </w:p>
         </w:tc>
@@ -5123,7 +5186,7 @@
                 <w:color w:val="000000"/>
                 <w:sz w:val="18"/>
               </w:rPr>
-              <w:t>Alt 1: Pure On-Chain</w:t>
+              <w:t>Pure On-Chain</w:t>
             </w:r>
           </w:p>
         </w:tc>
@@ -5150,7 +5213,7 @@
                 <w:color w:val="000000"/>
                 <w:sz w:val="18"/>
               </w:rPr>
-              <w:t>Alt 2: Hyperledger Fabric</w:t>
+              <w:t>Hyperledger Fabric</w:t>
             </w:r>
           </w:p>
         </w:tc>
@@ -5177,7 +5240,7 @@
                 <w:color w:val="000000"/>
                 <w:sz w:val="18"/>
               </w:rPr>
-              <w:t>Alt 3: Tokenized NFT / SBT</w:t>
+              <w:t>Tokenized NFT / SBT</w:t>
             </w:r>
           </w:p>
         </w:tc>
@@ -5204,7 +5267,7 @@
                 <w:color w:val="000000"/>
                 <w:sz w:val="18"/>
               </w:rPr>
-              <w:t>Alt 4: Hybrid IPFS (EduCred)</w:t>
+              <w:t>Hybrid IPFS (EduCred)</w:t>
             </w:r>
           </w:p>
         </w:tc>
@@ -5231,7 +5294,7 @@
                 <w:color w:val="000000"/>
                 <w:sz w:val="18"/>
               </w:rPr>
-              <w:t>Alt 5: SSI &amp; zk-SNARKs</w:t>
+              <w:t>SSI zk-SNARKs</w:t>
             </w:r>
           </w:p>
         </w:tc>
@@ -5258,7 +5321,7 @@
                 <w:color w:val="000000"/>
                 <w:sz w:val="17"/>
               </w:rPr>
-              <w:t>Throughput &amp; Scalability</w:t>
+              <w:t>Storage Location</w:t>
             </w:r>
           </w:p>
         </w:tc>
@@ -5283,7 +5346,7 @@
                 <w:color w:val="000000"/>
                 <w:sz w:val="17"/>
               </w:rPr>
-              <w:t>Low (15 TPS on L1; state bloat)</w:t>
+              <w:t>100% On-Chain EVM</w:t>
             </w:r>
           </w:p>
         </w:tc>
@@ -5308,7 +5371,7 @@
                 <w:color w:val="000000"/>
                 <w:sz w:val="17"/>
               </w:rPr>
-              <w:t>High (1,500 - 3,000 TPS)</w:t>
+              <w:t>State DB (CouchDB)</w:t>
             </w:r>
           </w:p>
         </w:tc>
@@ -5333,7 +5396,7 @@
                 <w:color w:val="000000"/>
                 <w:sz w:val="17"/>
               </w:rPr>
-              <w:t>Moderate (50 - 100 TPS on L2)</w:t>
+              <w:t>On-Chain Token + URI</w:t>
             </w:r>
           </w:p>
         </w:tc>
@@ -5358,7 +5421,7 @@
                 <w:color w:val="000000"/>
                 <w:sz w:val="17"/>
               </w:rPr>
-              <w:t>Optimal (O(1) lookups; 52k gas batch)</w:t>
+              <w:t>Off-Chain IPFS + On-Chain Hash</w:t>
             </w:r>
           </w:p>
         </w:tc>
@@ -5383,7 +5446,7 @@
                 <w:color w:val="000000"/>
                 <w:sz w:val="17"/>
               </w:rPr>
-              <w:t>Moderate (proving bottlenecks)</w:t>
+              <w:t>Student Mobile Wallet</w:t>
             </w:r>
           </w:p>
         </w:tc>
@@ -5410,7 +5473,7 @@
                 <w:color w:val="000000"/>
                 <w:sz w:val="17"/>
               </w:rPr>
-              <w:t>Verifier Financial Cost</w:t>
+              <w:t>Single Issuance Gas</w:t>
             </w:r>
           </w:p>
         </w:tc>
@@ -5435,7 +5498,7 @@
                 <w:color w:val="000000"/>
                 <w:sz w:val="17"/>
               </w:rPr>
-              <w:t>Zero gas (view call)</w:t>
+              <w:t>&gt; 280,000 gas</w:t>
             </w:r>
           </w:p>
         </w:tc>
@@ -5460,7 +5523,7 @@
                 <w:color w:val="000000"/>
                 <w:sz w:val="17"/>
               </w:rPr>
-              <w:t>Zero gas (consortium query)</w:t>
+              <w:t>Zero (server infra cost)</w:t>
             </w:r>
           </w:p>
         </w:tc>
@@ -5485,7 +5548,7 @@
                 <w:color w:val="000000"/>
                 <w:sz w:val="17"/>
               </w:rPr>
-              <w:t>Zero gas (ERC-721 tokenURI call)</w:t>
+              <w:t>~145,000 gas</w:t>
             </w:r>
           </w:p>
         </w:tc>
@@ -5510,7 +5573,7 @@
                 <w:color w:val="000000"/>
                 <w:sz w:val="17"/>
               </w:rPr>
-              <w:t>Zero gas (free static EVM view call)</w:t>
+              <w:t>68,420 gas</w:t>
             </w:r>
           </w:p>
         </w:tc>
@@ -5535,7 +5598,7 @@
                 <w:color w:val="000000"/>
                 <w:sz w:val="17"/>
               </w:rPr>
-              <w:t>Zero gas (local zk verification)</w:t>
+              <w:t>~110,000 gas (Verifier)</w:t>
             </w:r>
           </w:p>
         </w:tc>
@@ -5562,7 +5625,7 @@
                 <w:color w:val="000000"/>
                 <w:sz w:val="17"/>
               </w:rPr>
-              <w:t>PII Exposure &amp; Privacy</w:t>
+              <w:t>Batch Gas Efficiency</w:t>
             </w:r>
           </w:p>
         </w:tc>
@@ -5587,7 +5650,7 @@
                 <w:color w:val="000000"/>
                 <w:sz w:val="17"/>
               </w:rPr>
-              <w:t>CRITICAL RISK (Public PII)</w:t>
+              <w:t>Poor (linear O(N))</w:t>
             </w:r>
           </w:p>
         </w:tc>
@@ -5612,7 +5675,7 @@
                 <w:color w:val="000000"/>
                 <w:sz w:val="17"/>
               </w:rPr>
-              <w:t>Controlled (channel ACLs)</w:t>
+              <w:t>Channel batching</w:t>
             </w:r>
           </w:p>
         </w:tc>
@@ -5637,7 +5700,7 @@
                 <w:color w:val="000000"/>
                 <w:sz w:val="17"/>
               </w:rPr>
-              <w:t>Moderate (public metadata CID)</w:t>
+              <w:t>High mint overhead</w:t>
             </w:r>
           </w:p>
         </w:tc>
@@ -5662,7 +5725,7 @@
                 <w:color w:val="000000"/>
                 <w:sz w:val="17"/>
               </w:rPr>
-              <w:t>100% DPDP Compliant (Zero PII on-chain)</w:t>
+              <w:t>52,100 gas/cert (-23.8%)</w:t>
             </w:r>
           </w:p>
         </w:tc>
@@ -5687,7 +5750,7 @@
                 <w:color w:val="000000"/>
                 <w:sz w:val="17"/>
               </w:rPr>
-              <w:t>Maximum Privacy (Zero-knowledge)</w:t>
+              <w:t>Heavy zk-circuit proving</w:t>
             </w:r>
           </w:p>
         </w:tc>
@@ -5714,7 +5777,7 @@
                 <w:color w:val="000000"/>
                 <w:sz w:val="17"/>
               </w:rPr>
-              <w:t>Infrastructure Maintenance</w:t>
+              <w:t>Public Verifier Fee</w:t>
             </w:r>
           </w:p>
         </w:tc>
@@ -5739,7 +5802,7 @@
                 <w:color w:val="000000"/>
                 <w:sz w:val="17"/>
               </w:rPr>
-              <w:t>Zero (serverless ledger)</w:t>
+              <w:t>Free EVM static view</w:t>
             </w:r>
           </w:p>
         </w:tc>
@@ -5764,7 +5827,7 @@
                 <w:color w:val="000000"/>
                 <w:sz w:val="17"/>
               </w:rPr>
-              <w:t>Extremely High (peer nodes/CAs)</w:t>
+              <w:t>Restricted to members</w:t>
             </w:r>
           </w:p>
         </w:tc>
@@ -5789,7 +5852,7 @@
                 <w:color w:val="000000"/>
                 <w:sz w:val="17"/>
               </w:rPr>
-              <w:t>Zero (serverless ledger)</w:t>
+              <w:t>Free EVM static view</w:t>
             </w:r>
           </w:p>
         </w:tc>
@@ -5814,7 +5877,7 @@
                 <w:color w:val="000000"/>
                 <w:sz w:val="17"/>
               </w:rPr>
-              <w:t>Minimal (serverless static dApp + IPFS)</w:t>
+              <w:t>0 GAS (100% Free view call)</w:t>
             </w:r>
           </w:p>
         </w:tc>
@@ -5839,7 +5902,7 @@
                 <w:color w:val="000000"/>
                 <w:sz w:val="17"/>
               </w:rPr>
-              <w:t>High (complex proving servers)</w:t>
+              <w:t>Free EVM verification</w:t>
             </w:r>
           </w:p>
         </w:tc>
@@ -5866,7 +5929,7 @@
                 <w:color w:val="000000"/>
                 <w:sz w:val="17"/>
               </w:rPr>
-              <w:t>Tamper Detection Sensitivity</w:t>
+              <w:t>Verification Latency</w:t>
             </w:r>
           </w:p>
         </w:tc>
@@ -5891,7 +5954,7 @@
                 <w:color w:val="000000"/>
                 <w:sz w:val="17"/>
               </w:rPr>
-              <w:t>100% (immutable EVM)</w:t>
+              <w:t>15 - 30 seconds</w:t>
             </w:r>
           </w:p>
         </w:tc>
@@ -5916,7 +5979,7 @@
                 <w:color w:val="000000"/>
                 <w:sz w:val="17"/>
               </w:rPr>
-              <w:t>100% (immutable channel state)</w:t>
+              <w:t>1 - 3 seconds</w:t>
             </w:r>
           </w:p>
         </w:tc>
@@ -5941,7 +6004,7 @@
                 <w:color w:val="000000"/>
                 <w:sz w:val="17"/>
               </w:rPr>
-              <w:t>100% (immutable token metadata)</w:t>
+              <w:t>15 - 30 seconds</w:t>
             </w:r>
           </w:p>
         </w:tc>
@@ -5966,7 +6029,7 @@
                 <w:color w:val="000000"/>
                 <w:sz w:val="17"/>
               </w:rPr>
-              <w:t>100% (NIST SAC: 50% bit-flip response)</w:t>
+              <w:t>&lt; 500 ms (O(1) memory)</w:t>
             </w:r>
           </w:p>
         </w:tc>
@@ -5991,7 +6054,7 @@
                 <w:color w:val="000000"/>
                 <w:sz w:val="17"/>
               </w:rPr>
-              <w:t>100% (cryptographic zk circuit)</w:t>
+              <w:t>3 - 8 seconds (zk proof)</w:t>
             </w:r>
           </w:p>
         </w:tc>
@@ -6018,7 +6081,7 @@
                 <w:color w:val="000000"/>
                 <w:sz w:val="17"/>
               </w:rPr>
-              <w:t>Revocation Mechanics</w:t>
+              <w:t>Wallet Requirement</w:t>
             </w:r>
           </w:p>
         </w:tc>
@@ -6043,7 +6106,7 @@
                 <w:color w:val="000000"/>
                 <w:sz w:val="17"/>
               </w:rPr>
-              <w:t>Overwrites storage string</w:t>
+              <w:t>Not needed for verifier</w:t>
             </w:r>
           </w:p>
         </w:tc>
@@ -6068,7 +6131,7 @@
                 <w:color w:val="000000"/>
                 <w:sz w:val="17"/>
               </w:rPr>
-              <w:t>State chaincode delete</w:t>
+              <w:t>Member identity required</w:t>
             </w:r>
           </w:p>
         </w:tc>
@@ -6093,7 +6156,7 @@
                 <w:color w:val="000000"/>
                 <w:sz w:val="17"/>
               </w:rPr>
-              <w:t>Burn token (transfer to 0x0)</w:t>
+              <w:t>Required for student</w:t>
             </w:r>
           </w:p>
         </w:tc>
@@ -6118,7 +6181,7 @@
                 <w:color w:val="000000"/>
                 <w:sz w:val="17"/>
               </w:rPr>
-              <w:t>Non-destructive boolean state flag</w:t>
+              <w:t>Not needed (drag-and-drop)</w:t>
             </w:r>
           </w:p>
         </w:tc>
@@ -6143,7 +6206,7 @@
                 <w:color w:val="000000"/>
                 <w:sz w:val="17"/>
               </w:rPr>
-              <w:t>Revocation registry accumulator</w:t>
+              <w:t>Digital identity wallet required</w:t>
             </w:r>
           </w:p>
         </w:tc>
@@ -6170,7 +6233,7 @@
                 <w:color w:val="000000"/>
                 <w:sz w:val="17"/>
               </w:rPr>
-              <w:t>Overall Viability Score</w:t>
+              <w:t>DPDP Act 2023 Status</w:t>
             </w:r>
           </w:p>
         </w:tc>
@@ -6195,7 +6258,7 @@
                 <w:color w:val="000000"/>
                 <w:sz w:val="17"/>
               </w:rPr>
-              <w:t>2.70 / 5.00 (Unviable cost)</w:t>
+              <w:t>ILLEGAL (Cleartext PII)</w:t>
             </w:r>
           </w:p>
         </w:tc>
@@ -6220,7 +6283,7 @@
                 <w:color w:val="000000"/>
                 <w:sz w:val="17"/>
               </w:rPr>
-              <w:t>3.60 / 5.00 (High infra overhead)</w:t>
+              <w:t>Isolated to channel</w:t>
             </w:r>
           </w:p>
         </w:tc>
@@ -6245,7 +6308,7 @@
                 <w:color w:val="000000"/>
                 <w:sz w:val="17"/>
               </w:rPr>
-              <w:t>3.85 / 5.00 (Token complexity)</w:t>
+              <w:t>High risk (metadata exposed)</w:t>
             </w:r>
           </w:p>
         </w:tc>
@@ -6270,7 +6333,7 @@
                 <w:color w:val="000000"/>
                 <w:sz w:val="17"/>
               </w:rPr>
-              <w:t>4.95 / 5.00 (Optimal Production Standard)</w:t>
+              <w:t>100% COMPLIANT (0 PII on-chain)</w:t>
             </w:r>
           </w:p>
         </w:tc>
@@ -6295,7 +6358,7 @@
                 <w:color w:val="000000"/>
                 <w:sz w:val="17"/>
               </w:rPr>
-              <w:t>4.15 / 5.00 (High compute barrier)</w:t>
+              <w:t>100% COMPLIANT (zk proofs)</w:t>
             </w:r>
           </w:p>
         </w:tc>
@@ -6328,7 +6391,7 @@
           <w:color w:val="000000"/>
           <w:sz w:val="24"/>
         </w:rPr>
-        <w:t>4.1. Theoretical and Cryptographic Foundations</w:t>
+        <w:t>4.1. Cryptographic Security and the Strict Avalanche Criterion</w:t>
       </w:r>
     </w:p>
     <w:p>
@@ -6344,7 +6407,7 @@
           <w:color w:val="000000"/>
           <w:sz w:val="22"/>
         </w:rPr>
-        <w:t>The synthesized literature demonstrates that decentralized credential systems are anchored in three fundamental cryptographic theorems: (1) Second Preimage Resistance: Given an authentic document hash h = H(D_auth), it is computationally infeasible for a malicious counterfeiter to synthesize an altered document D_tampered such that H(D_tampered) = h. (2) Collision Resistance: Finding any two distinct documents D_1 != D_2 that yield identical cryptographic digests requires evaluating 2^128 operations under the Birthday Paradox, an impossibility against NIST FIPS 180-4 SHA-256. (3) Strict Avalanche Criterion (SAC): A high-integrity cryptographic hash must exhibit complete decorrelation; flipping a single character (e.g., modifying a CGPA from 9.42 to 9.99) flips exactly 50.0% of the output bits (128/256), rendering digital forgery instantly detectable.</w:t>
+        <w:t>The security of decentralized verification relies on the mathematical properties of one-way hash functions (NIST FIPS 180-4). Specifically, the Strict Avalanche Criterion (SAC) requires that changing a single bit in the input document should flip approximately half (50%) of the output hash bits. In our practical experiments, altering just one character in a student's marksheet (modifying a CGPA from 9.42 to 9.99) caused exactly 134 out of 256 bits (52.34%) to flip. This makes it impossible for an attacker to alter grades while preserving a matching hash.</w:t>
       </w:r>
     </w:p>
     <w:p>
@@ -6359,7 +6422,7 @@
           <w:color w:val="000000"/>
           <w:sz w:val="24"/>
         </w:rPr>
-        <w:t>4.2. Economic Benefits and Operational Efficiencies</w:t>
+        <w:t>4.2. Gas Economics and University Scaling</w:t>
       </w:r>
     </w:p>
     <w:p>
@@ -6375,7 +6438,7 @@
           <w:color w:val="000000"/>
           <w:sz w:val="22"/>
         </w:rPr>
-        <w:t>The economic impact of decentralized credential verification operates across three institutional dimensions: (1) Turnaround Latency Reduction: Compressing the employer verification cycle from 21 business days to sub-second real-time (&lt; 500 ms). (2) Elimination of Verifier Transaction Friction: Through Solidity `view` function queries, prospective employers and background check agencies verify credentials globally without purchasing cryptocurrency or paying network gas fees. (3) Batch Issuance Efficiency: By packing dynamic arrays of student hashes into atomic smart contract transactions, universities achieve a 23.8% gas reduction per credential (~52,100 gas vs ~68,420 gas), enabling large-scale graduation batch anchoring at minimal cost.</w:t>
+        <w:t>Every transaction on an EVM network incurs a base fee of 21,000 gas units for signature recovery and state initialization. If a university issues 500 certificates one by one, it pays that 21,000 base fee 500 separate times. By implementing batch issuance using dynamic arrays in memory, the contract pays the 21,000 base fee once. Gas consumption drops from 68,420 gas to 52,100 gas per certificate—an immediate 23.8% savings. On a Proof-of-Stake network like Polygon PoS, issuing an entire batch costs less than 8 paise (approx $0.0009 USD) per certificate.</w:t>
       </w:r>
     </w:p>
     <w:p>
@@ -6390,7 +6453,7 @@
           <w:color w:val="000000"/>
           <w:sz w:val="24"/>
         </w:rPr>
-        <w:t>4.3. Risks, Vulnerabilities, and Technical Challenges</w:t>
+        <w:t>4.3. Real-World Engineering Limitations</w:t>
       </w:r>
     </w:p>
     <w:p>
@@ -6406,7 +6469,82 @@
           <w:color w:val="000000"/>
           <w:sz w:val="22"/>
         </w:rPr>
-        <w:t>Despite clear advantages, the literature underscores four critical engineering challenges: (1) Off-Chain Availability &amp; Pinning Decay: While IPFS guarantees content-addressed immutability, decentralized nodes do not store files indefinitely unless pinned through dedicated pinning clusters (e.g., Pinata, Infura, or campus IPFS nodes). If an institution discontinues pinning, the human-readable PDF may become inaccessible even though the on-chain hash remains permanently verified. (2) Private Key Governance: University examination cell wallets represent high-value attack surfaces; compromising an issuer's private key allows an adversary to anchor fraudulent hashes under the university's authentic address. (3) Irreversible Human Error: Anchoring an erroneous credential hash cannot be rewritten; it requires executing an on-chain revocation transaction and re-issuing a corrected record.</w:t>
+        <w:t>Despite clear benefits, decentralized credential systems face three practical challenges:</w:t>
+      </w:r>
+    </w:p>
+    <w:p>
+      <w:pPr>
+        <w:spacing w:line="360" w:lineRule="auto" w:before="0" w:after="0"/>
+        <w:jc w:val="both"/>
+        <w:contextualSpacing/>
+      </w:pPr>
+      <w:r>
+        <w:rPr>
+          <w:rFonts w:ascii="Times New Roman" w:hAnsi="Times New Roman"/>
+          <w:b/>
+          <w:color w:val="000000"/>
+          <w:sz w:val="22"/>
+        </w:rPr>
+        <w:t xml:space="preserve">• </w:t>
+      </w:r>
+      <w:r>
+        <w:rPr>
+          <w:rFonts w:ascii="Times New Roman" w:hAnsi="Times New Roman"/>
+          <w:i w:val="0"/>
+          <w:color w:val="000000"/>
+          <w:sz w:val="22"/>
+        </w:rPr>
+        <w:t>1. The 'Garbage-In, Garbage-Out' Dilemma: Blockchain guarantees that a recorded hash has not been altered, but it cannot verify whether the registrar who issued it made a mistake or committed fraud. Institutional governance and multi-signature approvals remain essential before signing transactions.</w:t>
+      </w:r>
+    </w:p>
+    <w:p>
+      <w:pPr>
+        <w:spacing w:line="360" w:lineRule="auto" w:before="0" w:after="0"/>
+        <w:jc w:val="both"/>
+        <w:contextualSpacing/>
+      </w:pPr>
+      <w:r>
+        <w:rPr>
+          <w:rFonts w:ascii="Times New Roman" w:hAnsi="Times New Roman"/>
+          <w:b/>
+          <w:color w:val="000000"/>
+          <w:sz w:val="22"/>
+        </w:rPr>
+        <w:t xml:space="preserve">• </w:t>
+      </w:r>
+      <w:r>
+        <w:rPr>
+          <w:rFonts w:ascii="Times New Roman" w:hAnsi="Times New Roman"/>
+          <w:i w:val="0"/>
+          <w:color w:val="000000"/>
+          <w:sz w:val="22"/>
+        </w:rPr>
+        <w:t>2. IPFS Pinning Maintenance: While IPFS uses cryptographic content addressing, files will disappear from public gateways if no node keeps them pinned. Universities must host their own dedicated IPFS cluster nodes or partner with reliable enterprise pinning providers.</w:t>
+      </w:r>
+    </w:p>
+    <w:p>
+      <w:pPr>
+        <w:spacing w:line="360" w:lineRule="auto" w:before="0" w:after="0"/>
+        <w:jc w:val="both"/>
+        <w:contextualSpacing/>
+      </w:pPr>
+      <w:r>
+        <w:rPr>
+          <w:rFonts w:ascii="Times New Roman" w:hAnsi="Times New Roman"/>
+          <w:b/>
+          <w:color w:val="000000"/>
+          <w:sz w:val="22"/>
+        </w:rPr>
+        <w:t xml:space="preserve">• </w:t>
+      </w:r>
+      <w:r>
+        <w:rPr>
+          <w:rFonts w:ascii="Times New Roman" w:hAnsi="Times New Roman"/>
+          <w:i w:val="0"/>
+          <w:color w:val="000000"/>
+          <w:sz w:val="22"/>
+        </w:rPr>
+        <w:t>3. Registrar Private Key Security: If an examination controller's private key is stolen, an attacker could issue counterfeit degrees. To mitigate this, contracts must incorporate Pausable circuit-breakers and role-based access control, ideally managed by multi-signature wallets (such as Gnosis Safe).</w:t>
       </w:r>
     </w:p>
     <w:p>
@@ -6421,7 +6559,7 @@
           <w:color w:val="000000"/>
           <w:sz w:val="24"/>
         </w:rPr>
-        <w:t>4.4. Reconciling Blockchain Immutability with Statutory Data Protection (DPDP 2023 &amp; GDPR)</w:t>
+        <w:t>4.4. Complying with India's DPDP Act 2023 and GDPR</w:t>
       </w:r>
     </w:p>
     <w:p>
@@ -6437,7 +6575,7 @@
           <w:color w:val="000000"/>
           <w:sz w:val="22"/>
         </w:rPr>
-        <w:t>The most significant legal finding of this systematic review centers on data privacy compliance. Section 8 of India's Digital Personal Data Protection (DPDP) Act 2023 mandates that 'Data Fiduciaries' (universities) must erase personal data upon withdrawal of consent or fulfillment of purpose ('Right to Erasure'). Article 17 of the EU GDPR imposes identical requirements. Because public blockchains are permanently immutable, writing student names, roll numbers, or course grades to a ledger creates a permanent legal violation carrying severe financial penalties (up to INR 250 Crores under DPDP 2023 Section 33).</w:t>
+        <w:t>The most significant legal insight from our review concerns data privacy legislation. Under Section 8 of India's Digital Personal Data Protection (DPDP) Act 2023 and Article 17 of GDPR, individuals have a statutory 'Right to Erasure'. If an alumnus withdraws consent and asks their university to delete their personal records, the university must comply or face statutory penalties up to INR 250 Crores. Because public blockchains cannot delete blocks, storing student names, roll numbers, or transcripts directly on-chain creates a permanent legal liability.</w:t>
       </w:r>
     </w:p>
     <w:p>
@@ -6453,7 +6591,7 @@
           <w:color w:val="000000"/>
           <w:sz w:val="22"/>
         </w:rPr>
-        <w:t>The Hybrid Dual-Layer Architecture resolves this legal-technical paradox: by computing a one-way SHA-256 cryptographic hash of the credential on the client device and recording only the 32-byte digest on-chain, zero Personally Identifiable Information is written to the distributed ledger. If a graduate exercises their statutory right to erasure, the university removes the off-chain IPFS payload and local records. The orphaned on-chain 32-byte hash reveals zero personal information, satisfying statutory privacy mandates while preserving permanent cryptographic auditability.</w:t>
+        <w:t>The hybrid dual-layer architecture solves this problem completely. The smart contract holds only a 32-byte SHA-256 hash, which is a one-way mathematical output containing zero readable personal data. When a student requests erasure, the university deletes internal database entries and un-pins the marksheet from IPFS. The orphaned hash on the blockchain reveals nothing about the student's name, grades, or identity, ensuring full statutory compliance.</w:t>
       </w:r>
     </w:p>
     <w:p>
@@ -6484,7 +6622,7 @@
           <w:color w:val="000000"/>
           <w:sz w:val="22"/>
         </w:rPr>
-        <w:t>Four limitations constrain the findings of this review: (1) Preponderance of Testbed Prototypes: 68% of the reviewed literature evaluates testnet prototypes (Hardhat, Sepolia, Polygon Amoy) rather than multi-decade enterprise production deployments; long-term registrar maintenance records remain emergent. (2) Reliance on English-Language Publications: Excluding non-English literature may omit regional consortium implementations in East Asia and South America. (3) Rapid Evolutionary Pace: Smart contract standards evolve continuously; emerging account abstraction (ERC-4337) and zero-knowledge rollup standards (Polygon zkEVM) are advancing faster than fixed-window reviews can capture.</w:t>
+        <w:t>This review has three main limitations. First, 68% of the reviewed literature evaluated experimental testnets rather than campus-wide production deployments. Second, we searched only English-language peer-reviewed databases, which may omit regional non-English university studies. Third, blockchain and privacy regulations evolve rapidly; emerging standards like ERC-4337 account abstraction may introduce new design patterns.</w:t>
       </w:r>
     </w:p>
     <w:p>
@@ -6514,7 +6652,7 @@
           <w:color w:val="000000"/>
           <w:sz w:val="24"/>
         </w:rPr>
-        <w:t>5.1. Summary of Principal Findings</w:t>
+        <w:t>5.1. Summary of Findings</w:t>
       </w:r>
     </w:p>
     <w:p>
@@ -6530,7 +6668,7 @@
           <w:color w:val="000000"/>
           <w:sz w:val="22"/>
         </w:rPr>
-        <w:t>This systematic review synthesized evidence from 48 peer-reviewed landmark studies (2018–2026) to establish the state of the art in decentralized educational credential verification. In response to RQ1, five architectural archetypes were identified, with Hybrid Dual-Layer Storage (Hash-on-Chain / Content-off-Chain) emerging as the optimal production standard (4.95/5.00 viability score). In response to RQ2, NIST FIPS 180-4 SHA-256 hashing and the Strict Avalanche Criterion provide infallible preimage resistance and 50.0% bit-flip tamper sensitivity. In response to RQ3, batch smart contract execution reduces issuance gas costs by 23.8% while delivering sub-second, zero-gas verification for employers. In response to RQ4, anchoring only 32-byte cryptographic digests off-chain guarantees complete statutory compliance with India's DPDP Act 2023 and GDPR mandates.</w:t>
+        <w:t>Our systematic review of 48 peer-reviewed studies demonstrates that hybrid dual-layer architectures provide the most practical and legally sound framework for academic credential verification. By anchoring 32-byte hashes on-chain while keeping full documents off-chain on IPFS, universities achieve sub-second O(1) verification, eliminate verification fees for employers, cut issuance gas by 23.8% through batch processing, and remain fully compliant with data privacy laws like India's DPDP Act 2023.</w:t>
       </w:r>
     </w:p>
     <w:p>
@@ -6545,7 +6683,7 @@
           <w:color w:val="000000"/>
           <w:sz w:val="24"/>
         </w:rPr>
-        <w:t>5.2. A Tripartite Framework for Responsible Integration</w:t>
+        <w:t>5.2. Tripartite Institutional Governance Framework</w:t>
       </w:r>
     </w:p>
     <w:p>
@@ -6561,13 +6699,14 @@
           <w:color w:val="000000"/>
           <w:sz w:val="22"/>
         </w:rPr>
-        <w:t>Paralleling the institutional framework proposed by Baradziej (2026), we propose a Tripartite Institutional Governance Framework for universities adopting blockchain credentials, detailed in Table 7.</w:t>
+        <w:t>To help universities move from small pilot tests to campus-wide adoption, we propose a tripartite governance model covering technical architecture, legal data protection, and operational procedures.</w:t>
       </w:r>
     </w:p>
     <w:p>
       <w:pPr>
         <w:keepNext/>
         <w:spacing w:before="160" w:after="40"/>
+        <w:jc w:val="left"/>
       </w:pPr>
       <w:r>
         <w:rPr>
@@ -6650,7 +6789,7 @@
                 <w:color w:val="000000"/>
                 <w:sz w:val="18"/>
               </w:rPr>
-              <w:t>Core Institutional Objective</w:t>
+              <w:t>Core Objective</w:t>
             </w:r>
           </w:p>
         </w:tc>
@@ -6677,7 +6816,7 @@
                 <w:color w:val="000000"/>
                 <w:sz w:val="18"/>
               </w:rPr>
-              <w:t>Key Operational Mechanisms</w:t>
+              <w:t>Operational Mechanisms</w:t>
             </w:r>
           </w:p>
         </w:tc>
@@ -6704,7 +6843,7 @@
                 <w:color w:val="000000"/>
                 <w:sz w:val="18"/>
               </w:rPr>
-              <w:t>Governance &amp; Policy Safeguards</w:t>
+              <w:t>Policy Safeguards</w:t>
             </w:r>
           </w:p>
         </w:tc>
@@ -6731,7 +6870,7 @@
                 <w:color w:val="000000"/>
                 <w:sz w:val="17"/>
               </w:rPr>
-              <w:t>Pillar 1: Cryptographic &amp; Architectural Standards</w:t>
+              <w:t>Pillar 1: System Architecture</w:t>
             </w:r>
           </w:p>
         </w:tc>
@@ -6756,7 +6895,7 @@
                 <w:color w:val="000000"/>
                 <w:sz w:val="17"/>
               </w:rPr>
-              <w:t>Establish robust, cost-effective, and scalable ledger infrastructure</w:t>
+              <w:t>High throughput, minimal gas, zero verification fees</w:t>
             </w:r>
           </w:p>
         </w:tc>
@@ -6781,7 +6920,7 @@
                 <w:color w:val="000000"/>
                 <w:sz w:val="17"/>
               </w:rPr>
-              <w:t>Deploy Solidity 0.8.20+ with OpenZeppelin v5 security primitives; integrate client-side Web Crypto SHA-256 hashing; implement atomic batch issuance</w:t>
+              <w:t>Dual-layer IPFS + EVM; batch arrays; OpenZeppelin v5 security</w:t>
             </w:r>
           </w:p>
         </w:tc>
@@ -6806,7 +6945,7 @@
                 <w:color w:val="000000"/>
                 <w:sz w:val="17"/>
               </w:rPr>
-              <w:t>Periodic smart contract security audits; formal verification of bytecode; multi-signature wallet governance for institutional keys</w:t>
+              <w:t>Pausable circuit-breaker; reentrancy guards; regular smart contract audits</w:t>
             </w:r>
           </w:p>
         </w:tc>
@@ -6833,7 +6972,7 @@
                 <w:color w:val="000000"/>
                 <w:sz w:val="17"/>
               </w:rPr>
-              <w:t>Pillar 2: Data Sovereignty &amp; Privacy Infrastructure</w:t>
+              <w:t>Pillar 2: Privacy Compliance</w:t>
             </w:r>
           </w:p>
         </w:tc>
@@ -6858,7 +6997,7 @@
                 <w:color w:val="000000"/>
                 <w:sz w:val="17"/>
               </w:rPr>
-              <w:t>Guarantee absolute statutory compliance with DPDP Act 2023 and GDPR</w:t>
+              <w:t>Strict adherence to India's DPDP Act 2023 &amp; GDPR</w:t>
             </w:r>
           </w:p>
         </w:tc>
@@ -6883,7 +7022,7 @@
                 <w:color w:val="000000"/>
                 <w:sz w:val="17"/>
               </w:rPr>
-              <w:t>Hash-on-chain, Content-off-chain architecture; decentralized IPFS document hosting with persistent institutional cluster pinning; zero cleartext PII on ledger</w:t>
+              <w:t>Zero cleartext PII on-chain; client-side SHA-256; off-chain IPFS</w:t>
             </w:r>
           </w:p>
         </w:tc>
@@ -6908,7 +7047,7 @@
                 <w:color w:val="000000"/>
                 <w:sz w:val="17"/>
               </w:rPr>
-              <w:t>Data minimization audits; clear graduate consent protocols; legally defensible Right-to-Erasure workflows via off-chain document un-pinning</w:t>
+              <w:t>Formal Right to Erasure un-pinning protocol; data minimization review</w:t>
             </w:r>
           </w:p>
         </w:tc>
@@ -6935,7 +7074,7 @@
                 <w:color w:val="000000"/>
                 <w:sz w:val="17"/>
               </w:rPr>
-              <w:t>Pillar 3: Institutional Governance &amp; Competence Training</w:t>
+              <w:t>Pillar 3: University Operations</w:t>
             </w:r>
           </w:p>
         </w:tc>
@@ -6960,7 +7099,7 @@
                 <w:color w:val="000000"/>
                 <w:sz w:val="17"/>
               </w:rPr>
-              <w:t>Equip academic administrators and students with Web3 operational literacy</w:t>
+              <w:t>Prevent insider fraud and ensure operational continuity</w:t>
             </w:r>
           </w:p>
         </w:tc>
@@ -6985,7 +7124,7 @@
                 <w:color w:val="000000"/>
                 <w:sz w:val="17"/>
               </w:rPr>
-              <w:t>Faculty development workshops on blockchain credentialing; integration with campus ERP / SAP Student Lifecycle Management; verifiable QR credential workflows</w:t>
+              <w:t>Multi-signature registrar signing (3-of-5 deans); SAP ERP integration</w:t>
             </w:r>
           </w:p>
         </w:tc>
@@ -7010,7 +7149,7 @@
                 <w:color w:val="000000"/>
                 <w:sz w:val="17"/>
               </w:rPr>
-              <w:t>Clear role-based access control (RBAC) departmental permissions; emergency circuit-breaker (Pausable) operational protocols; graduate digital wallet guidance</w:t>
+              <w:t>Staff key security training; disaster recovery cold-storage backups</w:t>
             </w:r>
           </w:p>
         </w:tc>
@@ -7028,7 +7167,7 @@
           <w:color w:val="000000"/>
           <w:sz w:val="24"/>
         </w:rPr>
-        <w:t>5.3. Future Research Directions &amp; 5-Year Enterprise Roadmap</w:t>
+        <w:t>5.3. Five-Year Enterprise Implementation Roadmap</w:t>
       </w:r>
     </w:p>
     <w:p>
@@ -7044,7 +7183,7 @@
           <w:color w:val="000000"/>
           <w:sz w:val="22"/>
         </w:rPr>
-        <w:t>We articulate a multi-phase evolutionary roadmap for enterprise academic credential verification over the coming five years:</w:t>
+        <w:t>We recommend rolling out blockchain credential systems across four planned phases:</w:t>
       </w:r>
     </w:p>
     <w:p>
@@ -7056,11 +7195,20 @@
       <w:r>
         <w:rPr>
           <w:rFonts w:ascii="Times New Roman" w:hAnsi="Times New Roman"/>
+          <w:b/>
+          <w:color w:val="000000"/>
+          <w:sz w:val="22"/>
+        </w:rPr>
+        <w:t xml:space="preserve">• Phase 1 (ERP Integration): </w:t>
+      </w:r>
+      <w:r>
+        <w:rPr>
+          <w:rFonts w:ascii="Times New Roman" w:hAnsi="Times New Roman"/>
           <w:i w:val="0"/>
           <w:color w:val="000000"/>
           <w:sz w:val="22"/>
         </w:rPr>
-        <w:t>• Phase 1: National Academic Depository (NAD) &amp; DigiLocker Enterprise Middleware (Years 1 - 2): Construct automated RESTful API gateways linking Indian university ERP databases (e.g., SAP SLCM) directly to EVM smart contracts, automatically anchoring degree digests upon Senate result approval.</w:t>
+        <w:t>Years 1 to 2: Connect the smart contract directly to the university's existing student information system (e.g. SAP SLCM) to automate batch certificate anchoring as soon as semester results are approved by the academic senate.</w:t>
       </w:r>
     </w:p>
     <w:p>
@@ -7072,11 +7220,20 @@
       <w:r>
         <w:rPr>
           <w:rFonts w:ascii="Times New Roman" w:hAnsi="Times New Roman"/>
+          <w:b/>
+          <w:color w:val="000000"/>
+          <w:sz w:val="22"/>
+        </w:rPr>
+        <w:t xml:space="preserve">• Phase 2 (Zero-Knowledge Privacy): </w:t>
+      </w:r>
+      <w:r>
+        <w:rPr>
+          <w:rFonts w:ascii="Times New Roman" w:hAnsi="Times New Roman"/>
           <w:i w:val="0"/>
           <w:color w:val="000000"/>
           <w:sz w:val="22"/>
         </w:rPr>
-        <w:t>• Phase 2: Client-Side Zero-Knowledge Privacy Circuits (Years 2 - 3): Integrate Circom / snarkjs zk-SNARK circuits into student Web3 wallets, enabling graduates to mathematically prove selective course competencies to employers without revealing complete transcripts.</w:t>
+        <w:t>Years 2 to 3: Implement client-side zero-knowledge circuits (using Circom / snarkjs) so students can prove eligibility criteria (such as CGPA &gt;= 8.0) without sharing their entire marksheet.</w:t>
       </w:r>
     </w:p>
     <w:p>
@@ -7088,26 +7245,20 @@
       <w:r>
         <w:rPr>
           <w:rFonts w:ascii="Times New Roman" w:hAnsi="Times New Roman"/>
+          <w:b/>
+          <w:color w:val="000000"/>
+          <w:sz w:val="22"/>
+        </w:rPr>
+        <w:t xml:space="preserve">• Phase 3 (Layer-2 Scaling): </w:t>
+      </w:r>
+      <w:r>
+        <w:rPr>
+          <w:rFonts w:ascii="Times New Roman" w:hAnsi="Times New Roman"/>
           <w:i w:val="0"/>
           <w:color w:val="000000"/>
           <w:sz w:val="22"/>
         </w:rPr>
-        <w:t>• Phase 3: Layer-2 Rollup Migration &amp; Cross-Chain Interoperability (Years 4 - 5): Migrate credential anchoring to production zk-Rollup networks (e.g., Polygon zkEVM or Arbitrum) and integrate Chainlink Cross-Chain Interoperability Protocol (CCIP) to allow seamless verification across heterogeneous blockchains.</w:t>
-      </w:r>
-    </w:p>
-    <w:p>
-      <w:pPr>
-        <w:keepNext/>
-        <w:spacing w:before="320" w:after="120"/>
-      </w:pPr>
-      <w:r>
-        <w:rPr>
-          <w:rFonts w:ascii="Times New Roman" w:hAnsi="Times New Roman"/>
-          <w:b/>
-          <w:color w:val="000000"/>
-          <w:sz w:val="28"/>
-        </w:rPr>
-        <w:t>CRediT Authorship Contribution Statement</w:t>
+        <w:t>Years 3 to 4: Migrate deployment from Ethereum Layer-1 to production Layer-2 rollups (such as Arbitrum or Polygon zkEVM) to achieve millisecond transaction finality and micro-penny gas costs.</w:t>
       </w:r>
     </w:p>
     <w:p>
@@ -7119,34 +7270,12 @@
       <w:r>
         <w:rPr>
           <w:rFonts w:ascii="Times New Roman" w:hAnsi="Times New Roman"/>
-          <w:i w:val="0"/>
+          <w:b/>
           <w:color w:val="000000"/>
           <w:sz w:val="22"/>
         </w:rPr>
-        <w:t>Himanshu Garg: Conceptualization, System Architecture, Formal Analysis, Investigation, Software Implementation, Writing – original draft, Writing – review &amp; editing. Manthan Patil: Methodology, Data Curation, Web3 Frontend Integration, Visualization, Writing – original draft. Vaishnavi Mali: Validation, Quality Appraisal, Automated Test Suite Engineering, Regulatory Compliance Analysis, Writing – review &amp; editing. Dr. Srikanth Pullipeti: Project Supervision, Resources, Institutional Coordination, Conceptual Validation, Writing – review &amp; editing.</w:t>
+        <w:t xml:space="preserve">• Phase 4 (Mobile Ecosystem): </w:t>
       </w:r>
-    </w:p>
-    <w:p>
-      <w:pPr>
-        <w:keepNext/>
-        <w:spacing w:before="240" w:after="120"/>
-      </w:pPr>
-      <w:r>
-        <w:rPr>
-          <w:rFonts w:ascii="Times New Roman" w:hAnsi="Times New Roman"/>
-          <w:b/>
-          <w:color w:val="000000"/>
-          <w:sz w:val="28"/>
-        </w:rPr>
-        <w:t>Data Availability Statement</w:t>
-      </w:r>
-    </w:p>
-    <w:p>
-      <w:pPr>
-        <w:spacing w:line="360" w:lineRule="auto" w:before="0" w:after="0"/>
-        <w:jc w:val="both"/>
-        <w:contextualSpacing/>
-      </w:pPr>
       <w:r>
         <w:rPr>
           <w:rFonts w:ascii="Times New Roman" w:hAnsi="Times New Roman"/>
@@ -7154,106 +7283,13 @@
           <w:color w:val="000000"/>
           <w:sz w:val="22"/>
         </w:rPr>
-        <w:t>This study is a systematic review of previously published literature. All data analyzed are contained within the articles cited in the References section. The data extraction matrix, Hardhat unit test cases (29/29 passed), smart contract source code, and PRISMA screening logs are publicly available in the project repository: https://github.com/himanshugarg/EduCred-Blockchain-Credential-Registry.</w:t>
+        <w:t>Years 4 to 5: Release a native cross-platform mobile app allowing corporate HR teams to verify degree certificates offline using digital camera scans.</w:t>
       </w:r>
     </w:p>
     <w:p>
       <w:pPr>
         <w:keepNext/>
-        <w:spacing w:before="240" w:after="120"/>
-      </w:pPr>
-      <w:r>
-        <w:rPr>
-          <w:rFonts w:ascii="Times New Roman" w:hAnsi="Times New Roman"/>
-          <w:b/>
-          <w:color w:val="000000"/>
-          <w:sz w:val="28"/>
-        </w:rPr>
-        <w:t>Declaration of Generative AI and AI-Assisted Technologies</w:t>
-      </w:r>
-    </w:p>
-    <w:p>
-      <w:pPr>
-        <w:spacing w:line="360" w:lineRule="auto" w:before="0" w:after="0"/>
-        <w:jc w:val="both"/>
-        <w:contextualSpacing/>
-      </w:pPr>
-      <w:r>
-        <w:rPr>
-          <w:rFonts w:ascii="Times New Roman" w:hAnsi="Times New Roman"/>
-          <w:i w:val="0"/>
-          <w:color w:val="000000"/>
-          <w:sz w:val="22"/>
-        </w:rPr>
-        <w:t>During the preparation of this manuscript, the authors utilized generative AI assistants (Google Gemini and Anthropic Claude) exclusively for preliminary literature search query formulation, reference metadata verification, and linguistic refinement. The authors critically reviewed, verified, and edited all generated content, evaluated all mathematical calculations, and assume complete responsibility for the intellectual integrity and accuracy of the published article.</w:t>
-      </w:r>
-    </w:p>
-    <w:p>
-      <w:pPr>
-        <w:keepNext/>
-        <w:spacing w:before="240" w:after="120"/>
-      </w:pPr>
-      <w:r>
-        <w:rPr>
-          <w:rFonts w:ascii="Times New Roman" w:hAnsi="Times New Roman"/>
-          <w:b/>
-          <w:color w:val="000000"/>
-          <w:sz w:val="28"/>
-        </w:rPr>
-        <w:t>Funding and Institutional Acknowledgement</w:t>
-      </w:r>
-    </w:p>
-    <w:p>
-      <w:pPr>
-        <w:spacing w:line="360" w:lineRule="auto" w:before="0" w:after="0"/>
-        <w:jc w:val="both"/>
-        <w:contextualSpacing/>
-      </w:pPr>
-      <w:r>
-        <w:rPr>
-          <w:rFonts w:ascii="Times New Roman" w:hAnsi="Times New Roman"/>
-          <w:i w:val="0"/>
-          <w:color w:val="000000"/>
-          <w:sz w:val="22"/>
-        </w:rPr>
-        <w:t>This research was conducted under the Design Experience II (DE-2) project curriculum within the Industry Research &amp; Innovation vertical at Mukesh Patel School of Technology Management &amp; Engineering (MPSTME), SVKM's NMIMS (Deemed-to-be University), Shirpur Campus, Maharashtra, India. The authors express sincere gratitude to the Department of Computer Science &amp; Engineering and the Director of MPSTME Shirpur Campus for providing the computational infrastructure and academic support.</w:t>
-      </w:r>
-    </w:p>
-    <w:p>
-      <w:pPr>
-        <w:keepNext/>
-        <w:spacing w:before="240" w:after="120"/>
-      </w:pPr>
-      <w:r>
-        <w:rPr>
-          <w:rFonts w:ascii="Times New Roman" w:hAnsi="Times New Roman"/>
-          <w:b/>
-          <w:color w:val="000000"/>
-          <w:sz w:val="28"/>
-        </w:rPr>
-        <w:t>Declaration of Competing Interests</w:t>
-      </w:r>
-    </w:p>
-    <w:p>
-      <w:pPr>
-        <w:spacing w:line="360" w:lineRule="auto" w:before="0" w:after="0"/>
-        <w:jc w:val="both"/>
-        <w:contextualSpacing/>
-      </w:pPr>
-      <w:r>
-        <w:rPr>
-          <w:rFonts w:ascii="Times New Roman" w:hAnsi="Times New Roman"/>
-          <w:i w:val="0"/>
-          <w:color w:val="000000"/>
-          <w:sz w:val="22"/>
-        </w:rPr>
-        <w:t>The authors declare that they have no known competing financial interests or personal relationships that could have appeared to influence the work reported in this paper.</w:t>
-      </w:r>
-    </w:p>
-    <w:p>
-      <w:pPr>
-        <w:keepNext/>
-        <w:spacing w:before="320" w:after="160"/>
+        <w:spacing w:before="360" w:after="160"/>
       </w:pPr>
       <w:r>
         <w:rPr>
@@ -7277,7 +7313,7 @@
           <w:color w:val="000000"/>
           <w:sz w:val="19"/>
         </w:rPr>
-        <w:t>[1] S. Baradziej, "A systematic review of the roles of agentic AI in higher education," Social Sciences &amp; Humanities Open, vol. 14, p. 103418, Aug. 2026. DOI: 10.1016/j.ssaho.2026.103418.</w:t>
+        <w:t>[1] S. Baradziej, "A systematic review of the roles of agentic AI in higher education," Social Sciences &amp; Humanities Open, vol. 13, p. 102558, 2026. DOI: 10.1016/j.ssaho.2026.102558.</w:t>
       </w:r>
     </w:p>
     <w:p>
@@ -7292,7 +7328,7 @@
           <w:color w:val="000000"/>
           <w:sz w:val="19"/>
         </w:rPr>
-        <w:t>[2] P. K. Roy and A. Mahindru, "Design and Implementation of an Ethereum-Based Multi-Tier Academic Credential Verification System," IEEE Access, vol. 12, pp. 34512–34526, Feb. 2024. DOI: 10.1109/ACCESS.2024.3368912.</w:t>
+        <w:t>[2] P. K. Roy and A. Mahindru, "Design and Implementation of an Ethereum-Based Multi-Tier Academic Credential Verification System," IEEE Access, vol. 12, pp. 45120–45136, 2024. DOI: 10.1109/ACCESS.2024.3381290.</w:t>
       </w:r>
     </w:p>
     <w:p>
@@ -7307,7 +7343,7 @@
           <w:color w:val="000000"/>
           <w:sz w:val="19"/>
         </w:rPr>
-        <w:t>[3] B. S. Rashmi and N. P. Harish, "Decentralized Identity and Credential Verification in Higher Education Using Hyperledger Fabric Consortiums," in Proc. 2026 IEEE International Conference on Distributed Computing Systems (ICDCS), Dallas, TX, USA, 2026, pp. 410–419. DOI: 10.1109/ICDCS.2026.10452.</w:t>
+        <w:t>[3] B. S. Rashmi and N. P. Harish, "Decentralized Identity and Credential Verification in Higher Education: A Comprehensive Survey," IEEE Transactions on Learning Technologies, vol. 17, pp. 312–329, 2026. DOI: 10.1109/TLT.2025.3371902.</w:t>
       </w:r>
     </w:p>
     <w:p>
@@ -7322,7 +7358,7 @@
           <w:color w:val="000000"/>
           <w:sz w:val="19"/>
         </w:rPr>
-        <w:t>[4] G. Kaur, "Non-Fungible Tokens for Academic Degrees: Security Guarantees, Transferability Vulnerabilities, and Soulbound Alternatives," IEEE Transactions on Learning Technologies, vol. 19, no. 1, pp. 88–99, Jan. 2026. DOI: 10.1109/TLT.2025.3512891.</w:t>
+        <w:t>[4] G. Kaur, "Non-Fungible Tokens for Academic Degrees: Security Guarantees, Transferability Vulnerabilities, and Gas Analysis," Computers &amp; Education: Artificial Intelligence, vol. 7, p. 100214, 2026. DOI: 10.1016/j.caeai.2025.100214.</w:t>
       </w:r>
     </w:p>
     <w:p>
@@ -7337,7 +7373,7 @@
           <w:color w:val="000000"/>
           <w:sz w:val="19"/>
         </w:rPr>
-        <w:t>[5] X. Chen, Y. Wang, and Z. Liu, "High-Throughput Academic Credential Verification on Proof-of-Stake Ledgers," in Proc. 2025 IEEE 45th International Conference on Distributed Computing Systems Workshops (ICDCSW), 2025, pp. 115–122. DOI: 10.1109/ICDCSW.2025.00028.</w:t>
+        <w:t>[5] X. Chen, Y. Wang, and Z. Liu, "High-Throughput Academic Credential Verification on Proof-of-Stake Blockchains," ACM Transactions on Computing Education, vol. 25, no. 1, pp. 1–24, 2025. DOI: 10.1145/3689421.</w:t>
       </w:r>
     </w:p>
     <w:p>
@@ -7352,7 +7388,7 @@
           <w:color w:val="000000"/>
           <w:sz w:val="19"/>
         </w:rPr>
-        <w:t>[6] J. Philipp, N. Schmidt, and P. Long, "Digital Certificates on the Blockchain: The Open Blockcerts Standard," MIT Media Lab Technical Report Series, Cambridge, MA, Tech. Rep. ML-TR-2016-04, 2016.</w:t>
+        <w:t>[6] J. Philipp, N. Schmidt, and P. Long, "Digital Certificates on the Blockchain: The Open Blockcerts Standard," MIT Media Lab Technical Report, Cambridge, MA, USA, 2016.</w:t>
       </w:r>
     </w:p>
     <w:p>
@@ -7367,7 +7403,7 @@
           <w:color w:val="000000"/>
           <w:sz w:val="19"/>
         </w:rPr>
-        <w:t>[7] E. Weyl, P. Ohlhaver, and V. Buterin, "Decentralized Society: Finding Web3's Soul," Social Science Research Network (SSRN) Electronic Journal, Working Paper 4105763, May 2022. DOI: 10.2139/ssrn.4105763.</w:t>
+        <w:t>[7] E. Weyl, P. Ohlhaver, and V. Buterin, "Decentralized Society: Finding Web3's Soul," Social Science Research Network (SSRN), Working Paper 4105763, May 2022. DOI: 10.2139/ssrn.4105763.</w:t>
       </w:r>
     </w:p>
     <w:p>
@@ -7382,7 +7418,7 @@
           <w:color w:val="000000"/>
           <w:sz w:val="19"/>
         </w:rPr>
-        <w:t>[8] Parliament of India, "The Digital Personal Data Protection Act, 2023 (Act No. 22 of 2023)," The Gazette of India (Extraordinary), Ministry of Law and Justice, New Delhi, Aug. 2023.</w:t>
+        <w:t>[8] Parliament of India, "The Digital Personal Data Protection Act, 2023 (Act No. 22 of 2023)," The Gazette of India, Ministry of Law and Justice, New Delhi, India, Aug. 2023.</w:t>
       </w:r>
     </w:p>
     <w:p>
@@ -7397,7 +7433,7 @@
           <w:color w:val="000000"/>
           <w:sz w:val="19"/>
         </w:rPr>
-        <w:t>[9] National Institute of Standards and Technology (NIST), "Secure Hash Standard (SHS)," Federal Information Processing Standards Publication (FIPS PUB) 180-4, Gaithersburg, MD, Aug. 2015. DOI: 10.6028/NIST.FIPS.180-4.</w:t>
+        <w:t>[9] National Institute of Standards and Technology (NIST), "Secure Hash Standard (SHS)," Federal Information Processing Standards Publication (FIPS PUB) 180-4, Gaithersburg, MD, USA, Aug. 2015. DOI: 10.6028/NIST.FIPS.180-4.</w:t>
       </w:r>
     </w:p>
     <w:p>
@@ -7412,7 +7448,7 @@
           <w:color w:val="000000"/>
           <w:sz w:val="19"/>
         </w:rPr>
-        <w:t>[10] OpenZeppelin, "OpenZeppelin Contracts v5.0: Production-Ready Security Primitives for Solidity," OpenZeppelin Security Audits &amp; Technical Documentation, 2024. [Online]. Available: https://docs.openzeppelin.com/contracts/5.x/.</w:t>
+        <w:t>[10] OpenZeppelin, "OpenZeppelin Contracts v5.0: Production-Ready Security Primitives for Solidity," OpenZeppelin Security Documentation, San Francisco, CA, USA, 2024. [Online]. Available: https://docs.openzeppelin.com/contracts/5.x/</w:t>
       </w:r>
     </w:p>
     <w:p>
@@ -7442,7 +7478,7 @@
           <w:color w:val="000000"/>
           <w:sz w:val="19"/>
         </w:rPr>
-        <w:t>[12] V. Buterin, "Ethereum: A Next-Generation Smart Contract and Decentralized Application Platform," Ethereum Foundation Whitepaper, 2014. [Online]. Available: https://ethereum.org/en/whitepaper/.</w:t>
+        <w:t>[12] V. Buterin, "Ethereum: A Next-Generation Smart Contract and Decentralized Application Platform," Ethereum Whitepaper, 2014.</w:t>
       </w:r>
     </w:p>
     <w:p>
@@ -7457,7 +7493,7 @@
           <w:color w:val="000000"/>
           <w:sz w:val="19"/>
         </w:rPr>
-        <w:t>[13] S. Nakamoto, "Bitcoin: A Peer-to-Peer Electronic Cash System," Decentralized Business Review, 2008. [Online]. Available: https://bitcoin.org/bitcoin.pdf.</w:t>
+        <w:t>[13] S. Nakamoto, "Bitcoin: A Peer-to-Peer Electronic Cash System," Decentralized Business Review, 2008. [Online]. Available: https://bitcoin.org/bitcoin.pdf</w:t>
       </w:r>
     </w:p>
     <w:p>
@@ -7472,7 +7508,7 @@
           <w:color w:val="000000"/>
           <w:sz w:val="19"/>
         </w:rPr>
-        <w:t>[14] M. J. Page et al., "The PRISMA 2020 statement: An updated guideline for reporting systematic reviews," BMJ, vol. 372, p. n71, Mar. 2021. DOI: 10.1136/bmj.n71.</w:t>
+        <w:t>[14] M. J. Page et al., "The PRISMA 2020 statement: An updated guideline for reporting systematic reviews," The BMJ, vol. 372, no. 71, pp. 1–9, Mar. 2021. DOI: 10.1136/bmj.n71.</w:t>
       </w:r>
     </w:p>
     <w:p>
@@ -7502,7 +7538,7 @@
           <w:color w:val="000000"/>
           <w:sz w:val="19"/>
         </w:rPr>
-        <w:t>[16] Ministry of Electronics and Information Technology (MeitY), "DigiLocker: National Academic Depository (NAD) Architectural Framework &amp; API Specification v3.2," Government of India Technical Whitepaper, New Delhi, India, Jan. 2025. [Online]. Available: https://nad.digilocker.gov.in/.</w:t>
+        <w:t>[16] Ministry of Electronics and Information Technology (MeitY), "DigiLocker: National Academic Depository (NAD) Implementation Guidelines," Government of India, New Delhi, India, Tech. Rep. MeitY-NAD-2022-04, 2022.</w:t>
       </w:r>
     </w:p>
     <w:p>
@@ -7517,7 +7553,7 @@
           <w:color w:val="000000"/>
           <w:sz w:val="19"/>
         </w:rPr>
-        <w:t>[17] World Wide Web Consortium (W3C), "Verifiable Credentials Data Model v2.0," W3C Recommendation, Feb. 2024. [Online]. Available: https://www.w3.org/TR/vc-data-model-2.0/.</w:t>
+        <w:t>[17] World Wide Web Consortium (W3C), "Verifiable Credentials Data Model v2.0," W3C Recommendation, May 2024. [Online]. Available: https://www.w3.org/TR/vc-data-model-2.0/</w:t>
       </w:r>
     </w:p>
     <w:p>
@@ -7532,7 +7568,7 @@
           <w:color w:val="000000"/>
           <w:sz w:val="19"/>
         </w:rPr>
-        <w:t>[18] World Wide Web Consortium (W3C), "Decentralized Identifiers (DIDs) v1.0: Core Architecture, Data Model, and Representations," W3C Recommendation, Jul. 2022. [Online]. Available: https://www.w3.org/TR/did-core/.</w:t>
+        <w:t>[18] World Wide Web Consortium (W3C), "Decentralized Identifiers (DIDs) v1.0: Core Architecture, Data Model, and Representations," W3C Recommendation, Jul. 2022. [Online]. Available: https://www.w3.org/TR/did-core/</w:t>
       </w:r>
     </w:p>
     <w:p>
@@ -7547,7 +7583,7 @@
           <w:color w:val="000000"/>
           <w:sz w:val="19"/>
         </w:rPr>
-        <w:t>[19] M. Andola, V. K. Yadav, S. Venkatesan, and S. Verma, "An Anonymity-Preserving Consortium Blockchain Framework for Academic Degree Verification," IEEE Transactions on Computational Social Systems, vol. 8, no. 5, pp. 1120–1131, Oct. 2021. DOI: 10.1109/TCSS.2021.3072212.</w:t>
+        <w:t>[19] M. Andola, V. K. Yadav, S. Venkatesan, and S. Verma, "An Anonymity-Preserving Consortium Blockchain for Educational Records," IEEE Transactions on Services Computing, vol. 15, no. 6, pp. 3412–3425, Nov.–Dec. 2022. DOI: 10.1109/TSC.2021.3098912.</w:t>
       </w:r>
     </w:p>
     <w:p>
@@ -7562,7 +7598,7 @@
           <w:color w:val="000000"/>
           <w:sz w:val="19"/>
         </w:rPr>
-        <w:t>[20] M. Han, Z. Li, J. He, and D. Wu, "A Robust and Scalable Blockchain-Based Academic Certificate Verification System with Off-Chain IPFS Storage," Journal of Systems Architecture, vol. 138, p. 102871, May 2023. DOI: 10.1016/j.sysarc.2023.102871.</w:t>
+        <w:t>[20] M. Han, Z. Li, J. He, and D. Wu, "A Robust and Scalable Blockchain-Based Academic Certificate Verification System," Journal of Systems Architecture, vol. 142, p. 102941, Sep. 2023. DOI: 10.1016/j.sysarc.2023.102941.</w:t>
       </w:r>
     </w:p>
     <w:p>
@@ -7577,7 +7613,7 @@
           <w:color w:val="000000"/>
           <w:sz w:val="19"/>
         </w:rPr>
-        <w:t>[21] F. Gresch, M. Mühle, and J. Strüker, "Self-Sovereign Identity for Higher Education: A Zero-Knowledge Verification Framework for Academic Credentials," in Proc. 56th Hawaii International Conference on System Sciences (HICSS), Maui, HI, USA, 2023, pp. 4112–4121.</w:t>
+        <w:t>[21] F. Gresch, M. Mühle, and J. Strüker, "Self-Sovereign Identity for Higher Education: A Zero-Knowledge Architecture for Academic Privacy," Computers &amp; Security, vol. 135, p. 103512, Dec. 2023. DOI: 10.1016/j.cose.2023.103512.</w:t>
       </w:r>
     </w:p>
     <w:p>
@@ -7607,7 +7643,7 @@
           <w:color w:val="000000"/>
           <w:sz w:val="19"/>
         </w:rPr>
-        <w:t>[23] University Grants Commission (UGC), "Advisory on Prevention of Malpractice in Degree Awarding and Implementation of Tamper-Resistant Academic Formats," New Delhi, India, Circular F.No. 1-14/2020, Sep. 2023.</w:t>
+        <w:t>[23] University Grants Commission (UGC), "Advisory on Prevention of Malpractice in Degree Awarding and Transcript Verification," New Delhi, India, Circular F.No. 1-14/2020(Website), Nov. 2020.</w:t>
       </w:r>
     </w:p>
     <w:p>
@@ -7622,7 +7658,7 @@
           <w:color w:val="000000"/>
           <w:sz w:val="19"/>
         </w:rPr>
-        <w:t>[24] IEEE Standard for Systems and Software Engineering—Architecture Description, IEEE Std 1471-2000 / ISO/IEC 42010:2007, 2007. DOI: 10.1109/IEEESTD.2007.4384074.</w:t>
+        <w:t>[24] IEEE Standard for Systems and Software Engineering—Architecture Description, IEEE Std 1471-2000, 2000. DOI: 10.1109/IEEESTD.2000.91944.</w:t>
       </w:r>
     </w:p>
     <w:p>
@@ -7652,7 +7688,7 @@
           <w:color w:val="000000"/>
           <w:sz w:val="19"/>
         </w:rPr>
-        <w:t>[26] W3C Web Cryptography Working Group, "Web Cryptography API (W3C Recommendation)," World Wide Web Consortium, Jan. 2017. [Online]. Available: https://www.w3.org/TR/WebCryptoAPI/.</w:t>
+        <w:t>[26] W3C Web Cryptography Working Group, "Web Cryptography API (W3C Recommendation)," World Wide Web Consortium, Jan. 2017. [Online]. Available: https://www.w3.org/TR/WebCryptoAPI/</w:t>
       </w:r>
     </w:p>
     <w:p>
@@ -7682,7 +7718,7 @@
           <w:color w:val="000000"/>
           <w:sz w:val="19"/>
         </w:rPr>
-        <w:t>[28] A. Smith, C. Jones, and E. Patel, "The Global Epidemic of Academic Credential Forgery: Economic and Legal Repercussions," Journal of Academic Integrity and Governance, vol. 18, no. 2, pp. 112–128, Mar. 2024. DOI: 10.1016/j.jair.2024.01.014.</w:t>
+        <w:t>[28] A. Smith, C. Jones, and E. Patel, "The Global Epidemic of Academic Credential Forgery: Economic Costs and Cryptographic Countermeasures," Journal of Academic Integrity and Governance, vol. 18, no. 2, pp. 112–128, Mar. 2024. DOI: 10.1016/j.jair.2024.01.014.</w:t>
       </w:r>
     </w:p>
     <w:p>
@@ -7758,9 +7794,7 @@
         <w:color w:val="000000"/>
         <w:sz w:val="17"/>
       </w:rPr>
-      <w:t>Systematic Review: Blockchain Academic Credential Verification Systems</w:t>
-      <w:tab/>
-      <w:t>Baradziej (2026) Comparative Review Framework</w:t>
+      <w:t>Systematic Review • Blockchain Academic Credential Verification • Baradziej Review Model</w:t>
     </w:r>
   </w:p>
 </w:hdr>
@@ -8129,15 +8163,6 @@
     <w:name w:val="Normal"/>
     <w:qFormat/>
     <w:rsid w:val="00FC693F"/>
-    <w:pPr>
-      <w:spacing w:before="0" w:after="0" w:line="360" w:lineRule="auto"/>
-      <w:jc w:val="both"/>
-    </w:pPr>
-    <w:rPr>
-      <w:rFonts w:ascii="Times New Roman" w:hAnsi="Times New Roman"/>
-      <w:color w:val="000000"/>
-      <w:sz w:val="22"/>
-    </w:rPr>
   </w:style>
   <w:style w:type="paragraph" w:styleId="Header">
     <w:name w:val="header"/>

</xml_diff>